<commit_message>
Update spec doc 2026-07-15 21:33
</commit_message>
<xml_diff>
--- a/docs/Road Trip Planner — Specification.docx
+++ b/docs/Road Trip Planner — Specification.docx
@@ -4550,6 +4550,20 @@
     </w:p>
     <w:p>
       <w:pPr>
+        <w:pStyle w:val="ListBullet"/>
+        <w:ind w:left="432"/>
+      </w:pPr>
+      <w:r>
+        <w:rPr>
+          <w:rFonts w:ascii="Arial" w:hAnsi="Arial"/>
+          <w:i w:val="0"/>
+          <w:sz w:val="22"/>
+        </w:rPr>
+        <w:t>When editing an existing event, ‹ Prev and › Next buttons appear in the form header to cycle through all events in chronological order without closing the form. The buttons are disabled (grayed out) when there is no previous or next event.</w:t>
+      </w:r>
+    </w:p>
+    <w:p>
+      <w:pPr>
         <w:pStyle w:val="Heading2"/>
       </w:pPr>
       <w:r>
@@ -8720,7 +8734,7 @@
           <w:i w:val="0"/>
           <w:sz w:val="22"/>
         </w:rPr>
-        <w:t>The calendar displays 3 days at a time (instead of 7) to keep event bars readable on a narrow screen. On initial load, the view is anchored so that today falls in the centre column of row 3 (viewStart = today − 7 days). This keeps 6 past days visible above today and leaves future rows below, giving immediate context in both directions.</w:t>
+        <w:t>The calendar displays 3 days at a time (instead of 7) to keep event bars readable on a narrow screen. On initial load, the view is anchored so that today falls in the centre column of row 5 (viewStart = today − 13 days). This keeps 12 past days visible above today and leaves future rows below, making recent history immediately visible on open.</w:t>
       </w:r>
     </w:p>
     <w:p>

</xml_diff>

<commit_message>
Update spec doc 2026-07-15 21:51
</commit_message>
<xml_diff>
--- a/docs/Road Trip Planner — Specification.docx
+++ b/docs/Road Trip Planner — Specification.docx
@@ -5414,6 +5414,20 @@
           <w:i w:val="0"/>
           <w:sz w:val="22"/>
         </w:rPr>
+        <w:t>‹ Prev / Next › navigation buttons cycle through all events in chronological order without closing the popover. Buttons are grayed out at list boundaries. The popover repositions to stay within the viewport when navigating.</w:t>
+      </w:r>
+    </w:p>
+    <w:p>
+      <w:pPr>
+        <w:pStyle w:val="ListBullet"/>
+        <w:ind w:left="432"/>
+      </w:pPr>
+      <w:r>
+        <w:rPr>
+          <w:rFonts w:ascii="Arial" w:hAnsi="Arial"/>
+          <w:i w:val="0"/>
+          <w:sz w:val="22"/>
+        </w:rPr>
         <w:t>Close button (✕) and click-outside both close the popover.</w:t>
       </w:r>
     </w:p>

</xml_diff>

<commit_message>
Update spec doc 2026-07-16 13:41
</commit_message>
<xml_diff>
--- a/docs/Road Trip Planner — Specification.docx
+++ b/docs/Road Trip Planner — Specification.docx
@@ -4559,7 +4559,7 @@
           <w:i w:val="0"/>
           <w:sz w:val="22"/>
         </w:rPr>
-        <w:t>When editing an existing event, ‹ Prev and › Next buttons appear in the form header to cycle through all events in chronological order without closing the form. The buttons are disabled (grayed out) when there is no previous or next event.</w:t>
+        <w:t>When editing an existing event, ‹ Prev and › Next buttons appear in the form header to cycle through all events belonging to the same trip in chronological order without closing the form. The buttons are disabled (grayed out) when there is no previous or next event within that trip.</w:t>
       </w:r>
     </w:p>
     <w:p>
@@ -5414,7 +5414,7 @@
           <w:i w:val="0"/>
           <w:sz w:val="22"/>
         </w:rPr>
-        <w:t>‹ Prev / Next › navigation buttons cycle through all events in chronological order without closing the popover. Buttons are grayed out at list boundaries. The popover repositions to stay within the viewport when navigating.</w:t>
+        <w:t>‹ Prev / Next › navigation buttons cycle through all events belonging to the same trip in chronological order without closing the popover. Buttons are grayed out at list boundaries. The popover repositions to stay within the viewport when navigating.</w:t>
       </w:r>
     </w:p>
     <w:p>
@@ -8859,6 +8859,34 @@
           <w:sz w:val="22"/>
         </w:rPr>
         <w:t>Maximum height is 92 vh; the sheet is scrollable internally.</w:t>
+      </w:r>
+    </w:p>
+    <w:p>
+      <w:pPr>
+        <w:pStyle w:val="ListBullet"/>
+        <w:ind w:left="432"/>
+      </w:pPr>
+      <w:r>
+        <w:rPr>
+          <w:rFonts w:ascii="Arial" w:hAnsi="Arial"/>
+          <w:i w:val="0"/>
+          <w:sz w:val="22"/>
+        </w:rPr>
+        <w:t>The ‹ / › nav buttons row in the form header is sticky (position: sticky, top: 0) so it remains visible while scrolling the form fields.</w:t>
+      </w:r>
+    </w:p>
+    <w:p>
+      <w:pPr>
+        <w:pStyle w:val="ListBullet"/>
+        <w:ind w:left="432"/>
+      </w:pPr>
+      <w:r>
+        <w:rPr>
+          <w:rFonts w:ascii="Arial" w:hAnsi="Arial"/>
+          <w:i w:val="0"/>
+          <w:sz w:val="22"/>
+        </w:rPr>
+        <w:t>Tapping a day column to create a new event correctly maps the tap position to the 3-day mobile grid (uses getViewDays() = 3 rather than the desktop constant of 7).</w:t>
       </w:r>
     </w:p>
     <w:p>

</xml_diff>

<commit_message>
Update spec doc 2026-07-17 10:56
</commit_message>
<xml_diff>
--- a/docs/Road Trip Planner — Specification.docx
+++ b/docs/Road Trip Planner — Specification.docx
@@ -42,7 +42,7 @@
           <w:color w:val="64748B"/>
           <w:sz w:val="22"/>
         </w:rPr>
-        <w:t>Version 1.1  ·  Single-file HTML Application</w:t>
+        <w:t>Version 1.2  ·  Single-file HTML Application</w:t>
       </w:r>
     </w:p>
     <w:p>
@@ -2338,6 +2338,74 @@
           </w:p>
         </w:tc>
       </w:tr>
+      <w:tr>
+        <w:tc>
+          <w:tcPr>
+            <w:tcW w:type="dxa" w:w="2304"/>
+            <w:shd w:val="clear" w:color="auto" w:fill="F0F4F8"/>
+            <w:tcBorders>
+              <w:top w:val="single" w:sz="4" w:space="0" w:color="DDDDDD"/>
+              <w:left w:val="single" w:sz="4" w:space="0" w:color="DDDDDD"/>
+              <w:bottom w:val="single" w:sz="4" w:space="0" w:color="DDDDDD"/>
+              <w:right w:val="single" w:sz="4" w:space="0" w:color="DDDDDD"/>
+            </w:tcBorders>
+          </w:tcPr>
+          <w:p>
+            <w:r>
+              <w:rPr>
+                <w:rFonts w:ascii="Arial" w:hAnsi="Arial"/>
+                <w:b/>
+                <w:sz w:val="20"/>
+              </w:rPr>
+              <w:t>photos</w:t>
+            </w:r>
+          </w:p>
+        </w:tc>
+        <w:tc>
+          <w:tcPr>
+            <w:tcW w:type="dxa" w:w="1584"/>
+            <w:shd w:val="clear" w:color="auto" w:fill="F0F4F8"/>
+            <w:tcBorders>
+              <w:top w:val="single" w:sz="4" w:space="0" w:color="DDDDDD"/>
+              <w:left w:val="single" w:sz="4" w:space="0" w:color="DDDDDD"/>
+              <w:bottom w:val="single" w:sz="4" w:space="0" w:color="DDDDDD"/>
+              <w:right w:val="single" w:sz="4" w:space="0" w:color="DDDDDD"/>
+            </w:tcBorders>
+          </w:tcPr>
+          <w:p>
+            <w:r>
+              <w:rPr>
+                <w:rFonts w:ascii="Arial" w:hAnsi="Arial"/>
+                <w:b w:val="0"/>
+                <w:sz w:val="20"/>
+              </w:rPr>
+              <w:t>string[]</w:t>
+            </w:r>
+          </w:p>
+        </w:tc>
+        <w:tc>
+          <w:tcPr>
+            <w:tcW w:type="dxa" w:w="5040"/>
+            <w:shd w:val="clear" w:color="auto" w:fill="F0F4F8"/>
+            <w:tcBorders>
+              <w:top w:val="single" w:sz="4" w:space="0" w:color="DDDDDD"/>
+              <w:left w:val="single" w:sz="4" w:space="0" w:color="DDDDDD"/>
+              <w:bottom w:val="single" w:sz="4" w:space="0" w:color="DDDDDD"/>
+              <w:right w:val="single" w:sz="4" w:space="0" w:color="DDDDDD"/>
+            </w:tcBorders>
+          </w:tcPr>
+          <w:p>
+            <w:r>
+              <w:rPr>
+                <w:rFonts w:ascii="Arial" w:hAnsi="Arial"/>
+                <w:b w:val="0"/>
+                <w:sz w:val="20"/>
+              </w:rPr>
+              <w:t>Array of up to 5 photo URLs (uploaded to the repo's media/ folder). See Section 21.</w:t>
+            </w:r>
+          </w:p>
+        </w:tc>
+      </w:tr>
     </w:tbl>
     <w:p>
       <w:pPr>
@@ -5400,7 +5468,7 @@
           <w:i w:val="0"/>
           <w:sz w:val="22"/>
         </w:rPr>
-        <w:t>Action buttons: Edit and Delete.</w:t>
+        <w:t>Photo thumbnails (if the event has any) — a compact row of small images. Clicking one opens the full-screen lightbox (Section 21.4).</w:t>
       </w:r>
     </w:p>
     <w:p>
@@ -5414,7 +5482,7 @@
           <w:i w:val="0"/>
           <w:sz w:val="22"/>
         </w:rPr>
-        <w:t>‹ Prev / Next › navigation buttons cycle through all events belonging to the same trip in chronological order without closing the popover. Buttons are grayed out at list boundaries. The popover repositions to stay within the viewport when navigating.</w:t>
+        <w:t>Action row: a ‹ Prev button, then Edit and Delete, then a Next › button — in that left-to-right order, so the navigation buttons flank the Edit/Delete pair rather than sitting next to the close button. Prev/Next cycle through all events belonging to the same trip in chronological order without closing the popover, and are grayed out at list boundaries. The popover repositions to stay within the viewport when navigating.</w:t>
       </w:r>
     </w:p>
     <w:p>
@@ -5428,7 +5496,7 @@
           <w:i w:val="0"/>
           <w:sz w:val="22"/>
         </w:rPr>
-        <w:t>Close button (✕) and click-outside both close the popover.</w:t>
+        <w:t>Close button (✕) is pinned to the popover's absolute top-right corner, separate from the action row. Click-outside also closes the popover.</w:t>
       </w:r>
     </w:p>
     <w:p>
@@ -6816,6 +6884,20 @@
     </w:p>
     <w:p>
       <w:pPr>
+        <w:pStyle w:val="ListBullet"/>
+        <w:ind w:left="432"/>
+      </w:pPr>
+      <w:r>
+        <w:rPr>
+          <w:rFonts w:ascii="Arial" w:hAnsi="Arial"/>
+          <w:i w:val="0"/>
+          <w:sz w:val="22"/>
+        </w:rPr>
+        <w:t>photos</w:t>
+      </w:r>
+    </w:p>
+    <w:p>
+      <w:pPr>
         <w:spacing w:before="0" w:after="0"/>
       </w:pPr>
     </w:p>
@@ -6828,7 +6910,7 @@
           <w:color w:val="64748B"/>
           <w:sz w:val="20"/>
         </w:rPr>
-        <w:t>Dates are formatted as "YYYY-MM-DD HH:MM" (space-separated, local time). event_ref is a stable row index within the export used by linked_next_ref to reconstruct chains on import.</w:t>
+        <w:t>Dates are formatted as "YYYY-MM-DD HH:MM" (space-separated, local time). event_ref is a stable row index within the export used by linked_next_ref to reconstruct chains on import. photos is a pipe ("|")-joined list of photo URLs (empty if the event has none); links only, not the image bytes themselves — see Section 21.5.</w:t>
       </w:r>
     </w:p>
     <w:p>
@@ -8767,6 +8849,34 @@
     </w:p>
     <w:p>
       <w:pPr>
+        <w:pStyle w:val="ListBullet"/>
+        <w:ind w:left="432"/>
+      </w:pPr>
+      <w:r>
+        <w:rPr>
+          <w:rFonts w:ascii="Arial" w:hAnsi="Arial"/>
+          <w:i w:val="0"/>
+          <w:sz w:val="22"/>
+        </w:rPr>
+        <w:t>The shared day-of-week column header (Mon–Sun) is hidden on mobile, since it does not apply cleanly to a 3-day scrolling view where each row can start on a different weekday. Instead, each date number (.dnum) is prefixed with its own 2-letter day abbreviation (e.g. "We 16"), computed per row from that row's actual date rather than a fixed 7-day assumption — this fixes an earlier bug where non-first rows showed the wrong day name for their date.</w:t>
+      </w:r>
+    </w:p>
+    <w:p>
+      <w:pPr>
+        <w:pStyle w:val="ListBullet"/>
+        <w:ind w:left="432"/>
+      </w:pPr>
+      <w:r>
+        <w:rPr>
+          <w:rFonts w:ascii="Arial" w:hAnsi="Arial"/>
+          <w:i w:val="0"/>
+          <w:sz w:val="22"/>
+        </w:rPr>
+        <w:t>Tapping a day column to create a new event, and the cycle/navigation buttons, both derive the visible day count and per-row time span from getViewDays()/getViewMs() rather than hardcoded 7-day/week constants, so day-click mapping stays correct on the 3-day mobile grid.</w:t>
+      </w:r>
+    </w:p>
+    <w:p>
+      <w:pPr>
         <w:spacing w:before="0" w:after="0"/>
       </w:pPr>
     </w:p>
@@ -9187,10 +9297,780 @@
     </w:p>
     <w:p>
       <w:pPr>
+        <w:pStyle w:val="Heading2"/>
+      </w:pPr>
+      <w:r>
+        <w:t>18.5  Event Photo Sync</w:t>
+      </w:r>
+    </w:p>
+    <w:p>
+      <w:pPr>
+        <w:pStyle w:val="ListBullet"/>
+        <w:ind w:left="432"/>
+      </w:pPr>
+      <w:r>
+        <w:rPr>
+          <w:rFonts w:ascii="Arial" w:hAnsi="Arial"/>
+          <w:i w:val="0"/>
+          <w:sz w:val="22"/>
+        </w:rPr>
+        <w:t>Event photos are uploaded as separate image files under /media/ in the same repo (see Section 21.3) — they are not embedded in the trip CSV. The CSV's photos column stores only the resulting URLs.</w:t>
+      </w:r>
+    </w:p>
+    <w:p>
+      <w:pPr>
+        <w:pStyle w:val="ListBullet"/>
+        <w:ind w:left="432"/>
+      </w:pPr>
+      <w:r>
+        <w:rPr>
+          <w:rFonts w:ascii="Arial" w:hAnsi="Arial"/>
+          <w:i w:val="0"/>
+          <w:sz w:val="22"/>
+        </w:rPr>
+        <w:t>Because photo URLs are just another CSV field, Save/Load (this section) and manual CSV Export/Import (Section 13) both carry photos automatically as long as the photos column is present and populated with pipe-joined URLs.</w:t>
+      </w:r>
+    </w:p>
+    <w:p>
+      <w:pPr>
+        <w:pStyle w:val="ListBullet"/>
+        <w:ind w:left="432"/>
+      </w:pPr>
+      <w:r>
+        <w:rPr>
+          <w:rFonts w:ascii="Arial" w:hAnsi="Arial"/>
+          <w:i w:val="0"/>
+          <w:sz w:val="22"/>
+        </w:rPr>
+        <w:t>Photo uploads and deletions reuse the same GitHub token and repository configured for CSV sync — no separate credential is needed.</w:t>
+      </w:r>
+    </w:p>
+    <w:p>
+      <w:pPr>
+        <w:spacing w:before="0" w:after="0"/>
+      </w:pPr>
+    </w:p>
+    <w:p>
+      <w:pPr>
         <w:pStyle w:val="Heading1"/>
       </w:pPr>
       <w:r>
-        <w:t>19. Edge Cases &amp; Implementation Notes</w:t>
+        <w:t>19. Shareable Trip Links &amp; Read-Only View</w:t>
+      </w:r>
+    </w:p>
+    <w:p>
+      <w:pPr>
+        <w:pStyle w:val="Heading2"/>
+      </w:pPr>
+      <w:r>
+        <w:t>19.1  Purpose</w:t>
+      </w:r>
+    </w:p>
+    <w:p>
+      <w:r>
+        <w:rPr>
+          <w:rFonts w:ascii="Arial" w:hAnsi="Arial"/>
+          <w:sz w:val="22"/>
+        </w:rPr>
+        <w:t>A trip can be published as a read-only, shareable web link so that anyone with the URL can view the itinerary — including its calendar entries, trip summary, route maps, and photos — without needing the app installed or any local data of their own.</w:t>
+      </w:r>
+    </w:p>
+    <w:p>
+      <w:pPr>
+        <w:pStyle w:val="Heading2"/>
+      </w:pPr>
+      <w:r>
+        <w:t>19.2  Creating a Share Link</w:t>
+      </w:r>
+    </w:p>
+    <w:p>
+      <w:pPr>
+        <w:pStyle w:val="ListBullet"/>
+        <w:ind w:left="432"/>
+      </w:pPr>
+      <w:r>
+        <w:rPr>
+          <w:rFonts w:ascii="Arial" w:hAnsi="Arial"/>
+          <w:i w:val="0"/>
+          <w:sz w:val="22"/>
+        </w:rPr>
+        <w:t>Triggered by the share icon (gray, simple line-art design) among a trip's sidebar action buttons.</w:t>
+      </w:r>
+    </w:p>
+    <w:p>
+      <w:pPr>
+        <w:pStyle w:val="ListBullet"/>
+        <w:ind w:left="432"/>
+      </w:pPr>
+      <w:r>
+        <w:rPr>
+          <w:rFonts w:ascii="Arial" w:hAnsi="Arial"/>
+          <w:i w:val="0"/>
+          <w:sz w:val="22"/>
+        </w:rPr>
+        <w:t>The trip and its events are serialized to JSON (not CSV, so there is no URL length limit) and uploaded to /shared/{slug}-{8-hex}.json in the configured GitHub repository, reusing the same token as CSV sync.</w:t>
+      </w:r>
+    </w:p>
+    <w:p>
+      <w:pPr>
+        <w:pStyle w:val="ListBullet"/>
+        <w:ind w:left="432"/>
+      </w:pPr>
+      <w:r>
+        <w:rPr>
+          <w:rFonts w:ascii="Arial" w:hAnsi="Arial"/>
+          <w:i w:val="0"/>
+          <w:sz w:val="22"/>
+        </w:rPr>
+        <w:t>The resulting URL is https://{owner}.github.io/{repo}/?share={id} and is shown in a copyable share modal.</w:t>
+      </w:r>
+    </w:p>
+    <w:p>
+      <w:pPr>
+        <w:pStyle w:val="Heading2"/>
+      </w:pPr>
+      <w:r>
+        <w:t>19.3  Opening a Shared Link (Viewer)</w:t>
+      </w:r>
+    </w:p>
+    <w:p>
+      <w:pPr>
+        <w:pStyle w:val="ListBullet"/>
+        <w:ind w:left="432"/>
+      </w:pPr>
+      <w:r>
+        <w:rPr>
+          <w:rFonts w:ascii="Arial" w:hAnsi="Arial"/>
+          <w:i w:val="0"/>
+          <w:sz w:val="22"/>
+        </w:rPr>
+        <w:t>On load, the app checks for a ?share= query parameter before doing anything else. If present, it fetches the JSON payload from raw.githubusercontent.com and enters read-only mode, ignoring any trips/events already saved in the visitor's own localStorage.</w:t>
+      </w:r>
+    </w:p>
+    <w:p>
+      <w:pPr>
+        <w:pStyle w:val="ListBullet"/>
+        <w:ind w:left="432"/>
+      </w:pPr>
+      <w:r>
+        <w:rPr>
+          <w:rFonts w:ascii="Arial" w:hAnsi="Arial"/>
+          <w:i w:val="0"/>
+          <w:sz w:val="22"/>
+        </w:rPr>
+        <w:t>The calendar view is anchored to the first day of the shared trip (not today's date), and the sidebar is closed by default.</w:t>
+      </w:r>
+    </w:p>
+    <w:p>
+      <w:pPr>
+        <w:pStyle w:val="ListBullet"/>
+        <w:ind w:left="432"/>
+      </w:pPr>
+      <w:r>
+        <w:rPr>
+          <w:rFonts w:ascii="Arial" w:hAnsi="Arial"/>
+          <w:i w:val="0"/>
+          <w:sz w:val="22"/>
+        </w:rPr>
+        <w:t>A top banner ("👁 Read-only shared trip · {trip name}") is shown above the app header at all times, including while the Trip Summary modal is open, with a "View Trip Summary →" link. The Trip Summary opens automatically on load so the visitor immediately sees the itinerary.</w:t>
+      </w:r>
+    </w:p>
+    <w:p>
+      <w:pPr>
+        <w:pStyle w:val="ListBullet"/>
+        <w:ind w:left="432"/>
+      </w:pPr>
+      <w:r>
+        <w:rPr>
+          <w:rFonts w:ascii="Arial" w:hAnsi="Arial"/>
+          <w:i w:val="0"/>
+          <w:sz w:val="22"/>
+        </w:rPr>
+        <w:t>The banner also includes a "✨ Plan your own trip" button/link, which navigates to the app's base URL (no ?share= parameter) — dropping read-only mode so the visitor can start planning their own trips from a clean slate.</w:t>
+      </w:r>
+    </w:p>
+    <w:p>
+      <w:pPr>
+        <w:pStyle w:val="ListBullet"/>
+        <w:ind w:left="432"/>
+      </w:pPr>
+      <w:r>
+        <w:rPr>
+          <w:rFonts w:ascii="Arial" w:hAnsi="Arial"/>
+          <w:i w:val="0"/>
+          <w:sz w:val="22"/>
+        </w:rPr>
+        <w:t>If the shared JSON cannot be found (deleted or malformed link), the banner shows "⚠ Shared link not found or no longer available." instead.</w:t>
+      </w:r>
+    </w:p>
+    <w:p>
+      <w:pPr>
+        <w:pStyle w:val="Heading2"/>
+      </w:pPr>
+      <w:r>
+        <w:t>19.4  Read-Only Restrictions</w:t>
+      </w:r>
+    </w:p>
+    <w:p>
+      <w:r>
+        <w:rPr>
+          <w:rFonts w:ascii="Arial" w:hAnsi="Arial"/>
+          <w:sz w:val="22"/>
+        </w:rPr>
+        <w:t>A body.read-only CSS class hides every editing control app-wide: New Event, GitHub sync, New Trip, Import Trip, the event popover's Edit button, and each trip's Delete/Rename/Share buttons in the sidebar. The Trip Summary's own Print/Export and Trip Summary/Route Map viewing controls remain visible, since viewing is the entire point of a shared link.</w:t>
+      </w:r>
+    </w:p>
+    <w:p>
+      <w:pPr>
+        <w:spacing w:before="0" w:after="0"/>
+      </w:pPr>
+    </w:p>
+    <w:p>
+      <w:pPr>
+        <w:pStyle w:val="Heading1"/>
+      </w:pPr>
+      <w:r>
+        <w:t>20. Trip Route Maps</w:t>
+      </w:r>
+    </w:p>
+    <w:p>
+      <w:pPr>
+        <w:pStyle w:val="Heading2"/>
+      </w:pPr>
+      <w:r>
+        <w:t>20.1  Purpose</w:t>
+      </w:r>
+    </w:p>
+    <w:p>
+      <w:r>
+        <w:rPr>
+          <w:rFonts w:ascii="Arial" w:hAnsi="Arial"/>
+          <w:sz w:val="22"/>
+        </w:rPr>
+        <w:t>Each driving leg in the Trip Summary modal (Section 14) can display an embedded, interactive map showing the actual road route between departure and arrival, in addition to the existing text-based distance/time chips and Google Maps links.</w:t>
+      </w:r>
+    </w:p>
+    <w:p>
+      <w:pPr>
+        <w:pStyle w:val="Heading2"/>
+      </w:pPr>
+      <w:r>
+        <w:t>20.2  Rendering</w:t>
+      </w:r>
+    </w:p>
+    <w:p>
+      <w:pPr>
+        <w:pStyle w:val="ListBullet"/>
+        <w:ind w:left="432"/>
+      </w:pPr>
+      <w:r>
+        <w:rPr>
+          <w:rFonts w:ascii="Arial" w:hAnsi="Arial"/>
+          <w:i w:val="0"/>
+          <w:sz w:val="22"/>
+        </w:rPr>
+        <w:t>Maps use Leaflet 1.9.4 with OpenStreetMap tiles, embedded as a 200px-tall block beneath each driving leg's route/chips row (only on the first day the leg appears).</w:t>
+      </w:r>
+    </w:p>
+    <w:p>
+      <w:pPr>
+        <w:pStyle w:val="ListBullet"/>
+        <w:ind w:left="432"/>
+      </w:pPr>
+      <w:r>
+        <w:rPr>
+          <w:rFonts w:ascii="Arial" w:hAnsi="Arial"/>
+          <w:i w:val="0"/>
+          <w:sz w:val="22"/>
+        </w:rPr>
+        <w:t>The departure and arrival addresses are geocoded (reusing the app's existing Nominatim → Photon → simplified-address fallback chain, see Section 2.6), then a road-following route is requested from the public OSRM API (router.project-osrm.org) using overview=full and geometries=geojson.</w:t>
+      </w:r>
+    </w:p>
+    <w:p>
+      <w:pPr>
+        <w:pStyle w:val="ListBullet"/>
+        <w:ind w:left="432"/>
+      </w:pPr>
+      <w:r>
+        <w:rPr>
+          <w:rFonts w:ascii="Arial" w:hAnsi="Arial"/>
+          <w:i w:val="0"/>
+          <w:sz w:val="22"/>
+        </w:rPr>
+        <w:t>The route geometry is drawn as a bright-blue (#2563eb) polyline, always in this fixed color regardless of the trip's own color, so routes stand out clearly against the map tiles. If OSRM returns no route, a dashed straight line between the two points is drawn instead.</w:t>
+      </w:r>
+    </w:p>
+    <w:p>
+      <w:pPr>
+        <w:pStyle w:val="ListBullet"/>
+        <w:ind w:left="432"/>
+      </w:pPr>
+      <w:r>
+        <w:rPr>
+          <w:rFonts w:ascii="Arial" w:hAnsi="Arial"/>
+          <w:i w:val="0"/>
+          <w:sz w:val="22"/>
+        </w:rPr>
+        <w:t>A circular marker is placed at each endpoint, both colored bright blue to match the route, with a permanent "Start" / "End" label pinned above/below each marker respectively.</w:t>
+      </w:r>
+    </w:p>
+    <w:p>
+      <w:pPr>
+        <w:pStyle w:val="ListBullet"/>
+        <w:ind w:left="432"/>
+      </w:pPr>
+      <w:r>
+        <w:rPr>
+          <w:rFonts w:ascii="Arial" w:hAnsi="Arial"/>
+          <w:i w:val="0"/>
+          <w:sz w:val="22"/>
+        </w:rPr>
+        <w:t>The map auto-fits its viewport to the route bounds (or the two endpoints, for the straight-line fallback) with 24px padding.</w:t>
+      </w:r>
+    </w:p>
+    <w:p>
+      <w:pPr>
+        <w:pStyle w:val="Heading2"/>
+      </w:pPr>
+      <w:r>
+        <w:t>20.3  Loading Behavior &amp; Caching</w:t>
+      </w:r>
+    </w:p>
+    <w:p>
+      <w:pPr>
+        <w:pStyle w:val="ListBullet"/>
+        <w:ind w:left="432"/>
+      </w:pPr>
+      <w:r>
+        <w:rPr>
+          <w:rFonts w:ascii="Arial" w:hAnsi="Arial"/>
+          <w:i w:val="0"/>
+          <w:sz w:val="22"/>
+        </w:rPr>
+        <w:t>All driving legs in a trip begin geocoding and route-fetching in the background as soon as the app loads (or as soon as a shared trip's data arrives), not only when the Trip Summary modal is opened — so maps are typically already cached by the time the visitor looks at them.</w:t>
+      </w:r>
+    </w:p>
+    <w:p>
+      <w:pPr>
+        <w:pStyle w:val="ListBullet"/>
+        <w:ind w:left="432"/>
+      </w:pPr>
+      <w:r>
+        <w:rPr>
+          <w:rFonts w:ascii="Arial" w:hAnsi="Arial"/>
+          <w:i w:val="0"/>
+          <w:sz w:val="22"/>
+        </w:rPr>
+        <w:t>Geocode results and route geometries are cached in memory and persisted to localStorage (geocodes for 30 days, routes for 7 days), so repeat visits and repeat Trip Summary opens do not re-hit the external APIs.</w:t>
+      </w:r>
+    </w:p>
+    <w:p>
+      <w:pPr>
+        <w:pStyle w:val="ListBullet"/>
+        <w:ind w:left="432"/>
+      </w:pPr>
+      <w:r>
+        <w:rPr>
+          <w:rFonts w:ascii="Arial" w:hAnsi="Arial"/>
+          <w:i w:val="0"/>
+          <w:sz w:val="22"/>
+        </w:rPr>
+        <w:t>When multiple maps need fresh data from Nominatim (which rate-limits to 1 request/second), each leg is initialized sequentially with a throttling delay between API calls that only need to hit the network; already-cached legs render back-to-back without added delay.</w:t>
+      </w:r>
+    </w:p>
+    <w:p>
+      <w:pPr>
+        <w:pStyle w:val="ListBullet"/>
+        <w:ind w:left="432"/>
+      </w:pPr>
+      <w:r>
+        <w:rPr>
+          <w:rFonts w:ascii="Arial" w:hAnsi="Arial"/>
+          <w:i w:val="0"/>
+          <w:sz w:val="22"/>
+        </w:rPr>
+        <w:t>If a single leg's map fails to initialize, the error is isolated to that leg (a "Map failed to load" message is shown in its place) and does not stop the remaining legs' maps from loading.</w:t>
+      </w:r>
+    </w:p>
+    <w:p>
+      <w:pPr>
+        <w:pStyle w:val="ListBullet"/>
+        <w:ind w:left="432"/>
+      </w:pPr>
+      <w:r>
+        <w:rPr>
+          <w:rFonts w:ascii="Arial" w:hAnsi="Arial"/>
+          <w:i w:val="0"/>
+          <w:sz w:val="22"/>
+        </w:rPr>
+        <w:t>Editing a driving event's departure or arrival address invalidates that leg's cached route (but not its geocode cache) and re-warms it in the background automatically.</w:t>
+      </w:r>
+    </w:p>
+    <w:p>
+      <w:pPr>
+        <w:pStyle w:val="Heading2"/>
+      </w:pPr>
+      <w:r>
+        <w:t>20.4  Manual Refresh</w:t>
+      </w:r>
+    </w:p>
+    <w:p>
+      <w:r>
+        <w:rPr>
+          <w:rFonts w:ascii="Arial" w:hAnsi="Arial"/>
+          <w:sz w:val="22"/>
+        </w:rPr>
+        <w:t>Each individual map has its own small ↺ refresh button in its top-right corner. Clicking it clears only that leg's cached route (geocodes are preserved, since addresses rarely change), destroys and rebuilds that specific Leaflet map instance, and leaves every other map on the page untouched.</w:t>
+      </w:r>
+    </w:p>
+    <w:p>
+      <w:pPr>
+        <w:pStyle w:val="Heading2"/>
+      </w:pPr>
+      <w:r>
+        <w:t>20.5  Scroll &amp; Interaction Handling</w:t>
+      </w:r>
+    </w:p>
+    <w:p>
+      <w:pPr>
+        <w:pStyle w:val="ListBullet"/>
+        <w:ind w:left="432"/>
+      </w:pPr>
+      <w:r>
+        <w:rPr>
+          <w:rFonts w:ascii="Arial" w:hAnsi="Arial"/>
+          <w:i w:val="0"/>
+          <w:sz w:val="22"/>
+        </w:rPr>
+        <w:t>Each map initializes with scroll-wheel zoom and dragging disabled, so scrolling the Trip Summary body (including two-finger trackpad scrolling) over a map scrolls the page rather than zooming/panning the map.</w:t>
+      </w:r>
+    </w:p>
+    <w:p>
+      <w:pPr>
+        <w:pStyle w:val="ListBullet"/>
+        <w:ind w:left="432"/>
+      </w:pPr>
+      <w:r>
+        <w:rPr>
+          <w:rFonts w:ascii="Arial" w:hAnsi="Arial"/>
+          <w:i w:val="0"/>
+          <w:sz w:val="22"/>
+        </w:rPr>
+        <w:t>A small "Click to interact" pill sits in the map's bottom-right corner (positioned so it never covers the route itself). Clicking it enables scroll-zoom and dragging for that map only.</w:t>
+      </w:r>
+    </w:p>
+    <w:p>
+      <w:pPr>
+        <w:pStyle w:val="ListBullet"/>
+        <w:ind w:left="432"/>
+      </w:pPr>
+      <w:r>
+        <w:rPr>
+          <w:rFonts w:ascii="Arial" w:hAnsi="Arial"/>
+          <w:i w:val="0"/>
+          <w:sz w:val="22"/>
+        </w:rPr>
+        <w:t>Only one map can be interactive at a time: activating a map automatically deactivates whichever other map was previously active, and clicking anywhere outside the active map's container also deactivates it, restoring the "Click to interact" pill.</w:t>
+      </w:r>
+    </w:p>
+    <w:p>
+      <w:pPr>
+        <w:pStyle w:val="Heading2"/>
+      </w:pPr>
+      <w:r>
+        <w:t>20.6  Closing the Trip Summary</w:t>
+      </w:r>
+    </w:p>
+    <w:p>
+      <w:r>
+        <w:rPr>
+          <w:rFonts w:ascii="Arial" w:hAnsi="Arial"/>
+          <w:sz w:val="22"/>
+        </w:rPr>
+        <w:t>The modal always hides itself first, then cleans up (removes) every active Leaflet map instance afterward inside a try/catch — so an error thrown while destroying a map can never block the modal from closing, which was a prior bug particularly noticeable in the read-only shared view.</w:t>
+      </w:r>
+    </w:p>
+    <w:p>
+      <w:pPr>
+        <w:spacing w:before="0" w:after="0"/>
+      </w:pPr>
+    </w:p>
+    <w:p>
+      <w:pPr>
+        <w:pStyle w:val="Heading1"/>
+      </w:pPr>
+      <w:r>
+        <w:t>21. Event Photos</w:t>
+      </w:r>
+    </w:p>
+    <w:p>
+      <w:pPr>
+        <w:pStyle w:val="Heading2"/>
+      </w:pPr>
+      <w:r>
+        <w:t>21.1  Purpose</w:t>
+      </w:r>
+    </w:p>
+    <w:p>
+      <w:r>
+        <w:rPr>
+          <w:rFonts w:ascii="Arial" w:hAnsi="Arial"/>
+          <w:sz w:val="22"/>
+        </w:rPr>
+        <w:t>Any event, in any category, can carry up to 5 photos. Photos are attached in the event edit form and shown as thumbnails in both the event popover and the Trip Summary modal, with a full-screen lightbox for viewing them at larger size.</w:t>
+      </w:r>
+    </w:p>
+    <w:p>
+      <w:pPr>
+        <w:pStyle w:val="Heading2"/>
+      </w:pPr>
+      <w:r>
+        <w:t>21.2  Adding Photos (Event Form)</w:t>
+      </w:r>
+    </w:p>
+    <w:p>
+      <w:pPr>
+        <w:pStyle w:val="ListBullet"/>
+        <w:ind w:left="432"/>
+      </w:pPr>
+      <w:r>
+        <w:rPr>
+          <w:rFonts w:ascii="Arial" w:hAnsi="Arial"/>
+          <w:i w:val="0"/>
+          <w:sz w:val="22"/>
+        </w:rPr>
+        <w:t>A "Photos (up to 5)" field appears in the event form for every category, below the Description field. A "+ Add photo" button opens the device's native file picker (accept="image/*" multiple), which offers both camera roll/library and take-a-new-photo options on mobile.</w:t>
+      </w:r>
+    </w:p>
+    <w:p>
+      <w:pPr>
+        <w:pStyle w:val="ListBullet"/>
+        <w:ind w:left="432"/>
+      </w:pPr>
+      <w:r>
+        <w:rPr>
+          <w:rFonts w:ascii="Arial" w:hAnsi="Arial"/>
+          <w:i w:val="0"/>
+          <w:sz w:val="22"/>
+        </w:rPr>
+        <w:t>Selected photos appear immediately as thumbnails with an "Uploading…" overlay, then update in place once the upload completes (or show an error state on failure). Each thumbnail has its own ✕ remove button. The "+ Add photo" button hides once 5 photos are attached.</w:t>
+      </w:r>
+    </w:p>
+    <w:p>
+      <w:pPr>
+        <w:pStyle w:val="ListBullet"/>
+        <w:ind w:left="432"/>
+      </w:pPr>
+      <w:r>
+        <w:rPr>
+          <w:rFonts w:ascii="Arial" w:hAnsi="Arial"/>
+          <w:i w:val="0"/>
+          <w:sz w:val="22"/>
+        </w:rPr>
+        <w:t>Saving the event is blocked with an alert if any photo is still mid-upload, so a save can never silently drop a photo whose URL hasn't resolved yet.</w:t>
+      </w:r>
+    </w:p>
+    <w:p>
+      <w:pPr>
+        <w:pStyle w:val="Heading2"/>
+      </w:pPr>
+      <w:r>
+        <w:t>21.3  Resizing &amp; Upload</w:t>
+      </w:r>
+    </w:p>
+    <w:p>
+      <w:pPr>
+        <w:pStyle w:val="ListBullet"/>
+        <w:ind w:left="432"/>
+      </w:pPr>
+      <w:r>
+        <w:rPr>
+          <w:rFonts w:ascii="Arial" w:hAnsi="Arial"/>
+          <w:i w:val="0"/>
+          <w:sz w:val="22"/>
+        </w:rPr>
+        <w:t>Before upload, each photo is resized client-side via an off-screen &lt;canvas&gt;: capped to 1600px on the long edge and re-encoded as JPEG at 80% quality. This keeps page loads fast and avoids GitHub's practical size limits, regardless of how large the original camera photo was.</w:t>
+      </w:r>
+    </w:p>
+    <w:p>
+      <w:pPr>
+        <w:pStyle w:val="ListBullet"/>
+        <w:ind w:left="432"/>
+      </w:pPr>
+      <w:r>
+        <w:rPr>
+          <w:rFonts w:ascii="Arial" w:hAnsi="Arial"/>
+          <w:i w:val="0"/>
+          <w:sz w:val="22"/>
+        </w:rPr>
+        <w:t>The resized JPEG is base64-encoded and uploaded via the GitHub Contents API to /media/evphoto-{timestamp}-{random}.jpg in the configured repository, reusing the same token/repo already set up for CSV sync (Section 18.1) — no separate configuration step.</w:t>
+      </w:r>
+    </w:p>
+    <w:p>
+      <w:pPr>
+        <w:pStyle w:val="ListBullet"/>
+        <w:ind w:left="432"/>
+      </w:pPr>
+      <w:r>
+        <w:rPr>
+          <w:rFonts w:ascii="Arial" w:hAnsi="Arial"/>
+          <w:i w:val="0"/>
+          <w:sz w:val="22"/>
+        </w:rPr>
+        <w:t>The event's photos array stores the resulting https://raw.githubusercontent.com/... URLs, not the image data itself.</w:t>
+      </w:r>
+    </w:p>
+    <w:p>
+      <w:pPr>
+        <w:pStyle w:val="Heading2"/>
+      </w:pPr>
+      <w:r>
+        <w:t>21.4  Display &amp; Lightbox</w:t>
+      </w:r>
+    </w:p>
+    <w:p>
+      <w:pPr>
+        <w:pStyle w:val="ListBullet"/>
+        <w:ind w:left="432"/>
+      </w:pPr>
+      <w:r>
+        <w:rPr>
+          <w:rFonts w:ascii="Arial" w:hAnsi="Arial"/>
+          <w:i w:val="0"/>
+          <w:sz w:val="22"/>
+        </w:rPr>
+        <w:t>Event popover (Section 8.1): small (44px) thumbnails in a compact row.</w:t>
+      </w:r>
+    </w:p>
+    <w:p>
+      <w:pPr>
+        <w:pStyle w:val="ListBullet"/>
+        <w:ind w:left="432"/>
+      </w:pPr>
+      <w:r>
+        <w:rPr>
+          <w:rFonts w:ascii="Arial" w:hAnsi="Arial"/>
+          <w:i w:val="0"/>
+          <w:sz w:val="22"/>
+        </w:rPr>
+        <w:t>Trip Summary modal (Section 14): a larger responsive grid (200px-tall cells, matching the route map's height) shown only on the first day the event appears — a single photo fills the row width, multiple photos share the row before wrapping.</w:t>
+      </w:r>
+    </w:p>
+    <w:p>
+      <w:pPr>
+        <w:pStyle w:val="ListBullet"/>
+        <w:ind w:left="432"/>
+      </w:pPr>
+      <w:r>
+        <w:rPr>
+          <w:rFonts w:ascii="Arial" w:hAnsi="Arial"/>
+          <w:i w:val="0"/>
+          <w:sz w:val="22"/>
+        </w:rPr>
+        <w:t>Clicking any thumbnail (popover or Trip Summary) opens a shared full-screen lightbox overlay showing that photo at large size, with ‹ / › navigation between an event's photos, a position counter ("2 / 4"), a close button, and Escape/Left-arrow/Right-arrow keyboard support.</w:t>
+      </w:r>
+    </w:p>
+    <w:p>
+      <w:pPr>
+        <w:pStyle w:val="Heading2"/>
+      </w:pPr>
+      <w:r>
+        <w:t>21.5  Persistence Across Export/Import/Sync/Share</w:t>
+      </w:r>
+    </w:p>
+    <w:p>
+      <w:r>
+        <w:rPr>
+          <w:rFonts w:ascii="Arial" w:hAnsi="Arial"/>
+          <w:sz w:val="22"/>
+        </w:rPr>
+        <w:t>Photo URLs travel with the event through every existing persistence path: the photos CSV column (Sections 13 and 18.5), the JSON share-link payload (Section 19.2, via a full object copy that already includes photos), and localStorage. Only the URLs travel through CSV/JSON — the actual image bytes always live on GitHub, not inside the CSV/JSON payload itself.</w:t>
+      </w:r>
+    </w:p>
+    <w:p>
+      <w:pPr>
+        <w:pStyle w:val="Heading2"/>
+      </w:pPr>
+      <w:r>
+        <w:t>21.6  Orphan Cleanup</w:t>
+      </w:r>
+    </w:p>
+    <w:p>
+      <w:r>
+        <w:rPr>
+          <w:rFonts w:ascii="Arial" w:hAnsi="Arial"/>
+          <w:sz w:val="22"/>
+        </w:rPr>
+        <w:t>To avoid accumulating unused image files in the repository's /media/ folder, photos are actively deleted from GitHub in three situations:</w:t>
+      </w:r>
+    </w:p>
+    <w:p>
+      <w:pPr>
+        <w:pStyle w:val="ListBullet"/>
+        <w:ind w:left="432"/>
+      </w:pPr>
+      <w:r>
+        <w:rPr>
+          <w:rFonts w:ascii="Arial" w:hAnsi="Arial"/>
+          <w:i w:val="0"/>
+          <w:sz w:val="22"/>
+        </w:rPr>
+        <w:t>Removing a photo in the event form (✕ button) deletes it from GitHub immediately. If the photo is still mid-upload when removed, it is deleted as soon as that upload resolves rather than being left behind.</w:t>
+      </w:r>
+    </w:p>
+    <w:p>
+      <w:pPr>
+        <w:pStyle w:val="ListBullet"/>
+        <w:ind w:left="432"/>
+      </w:pPr>
+      <w:r>
+        <w:rPr>
+          <w:rFonts w:ascii="Arial" w:hAnsi="Arial"/>
+          <w:i w:val="0"/>
+          <w:sz w:val="22"/>
+        </w:rPr>
+        <w:t>Deleting an event purges its photos only once that deletion can no longer be undone (i.e. when the one-level undo stack, Section 12, would otherwise overwrite and discard the deleted event's snapshot) — this keeps normal Cmd/Ctrl+Z behavior working exactly as before while still cleaning up abandoned deletes.</w:t>
+      </w:r>
+    </w:p>
+    <w:p>
+      <w:pPr>
+        <w:pStyle w:val="ListBullet"/>
+        <w:ind w:left="432"/>
+      </w:pPr>
+      <w:r>
+        <w:rPr>
+          <w:rFonts w:ascii="Arial" w:hAnsi="Arial"/>
+          <w:i w:val="0"/>
+          <w:sz w:val="22"/>
+        </w:rPr>
+        <w:t>Deleting an entire trip purges every photo belonging to every event in that trip immediately, since trip deletion has no undo.</w:t>
+      </w:r>
+    </w:p>
+    <w:p>
+      <w:pPr>
+        <w:pStyle w:val="ListBullet"/>
+        <w:ind w:left="432"/>
+      </w:pPr>
+      <w:r>
+        <w:rPr>
+          <w:rFonts w:ascii="Arial" w:hAnsi="Arial"/>
+          <w:i w:val="0"/>
+          <w:sz w:val="22"/>
+        </w:rPr>
+        <w:t>CSV export/import intentionally stays link-only (no bundled ZIP of image files) — the CSV is treated as a lightweight itinerary export, with GitHub's /media/ folder remaining the single source of truth for the images themselves.</w:t>
+      </w:r>
+    </w:p>
+    <w:p>
+      <w:pPr>
+        <w:spacing w:before="0" w:after="0"/>
+      </w:pPr>
+    </w:p>
+    <w:p>
+      <w:pPr>
+        <w:pStyle w:val="Heading1"/>
+      </w:pPr>
+      <w:r>
+        <w:t>22. Edge Cases &amp; Implementation Notes</w:t>
       </w:r>
     </w:p>
     <w:p>
@@ -9289,6 +10169,34 @@
           <w:sz w:val="22"/>
         </w:rPr>
         <w:t>Address autocomplete in the driving form is debounced at ~300ms and uses Nominatim. The user may type any free-form text without triggering autocomplete.</w:t>
+      </w:r>
+    </w:p>
+    <w:p>
+      <w:pPr>
+        <w:pStyle w:val="ListBullet"/>
+        <w:ind w:left="432"/>
+      </w:pPr>
+      <w:r>
+        <w:rPr>
+          <w:rFonts w:ascii="Arial" w:hAnsi="Arial"/>
+          <w:i w:val="0"/>
+          <w:sz w:val="22"/>
+        </w:rPr>
+        <w:t>iOS auto-converts HEIC camera photos to JPEG when they are selected through a standard web file input, so the client-side photo resize step (Section 21.3) does not need any special HEIC handling.</w:t>
+      </w:r>
+    </w:p>
+    <w:p>
+      <w:pPr>
+        <w:pStyle w:val="ListBullet"/>
+        <w:ind w:left="432"/>
+      </w:pPr>
+      <w:r>
+        <w:rPr>
+          <w:rFonts w:ascii="Arial" w:hAnsi="Arial"/>
+          <w:i w:val="0"/>
+          <w:sz w:val="22"/>
+        </w:rPr>
+        <w:t>The GitHub Sync "Load" flow (Section 18.3) and the manual CSV "Import" flow (Section 13.2) are separate code paths with independent CSV parsers; any new column added to the CSV format (e.g. photos) must be wired into both, or data silently fails to round-trip through one of the two paths.</w:t>
       </w:r>
     </w:p>
     <w:p>

</xml_diff>

<commit_message>
Update spec doc 2026-07-17 11:10
</commit_message>
<xml_diff>
--- a/docs/Road Trip Planner — Specification.docx
+++ b/docs/Road Trip Planner — Specification.docx
@@ -42,7 +42,7 @@
           <w:color w:val="64748B"/>
           <w:sz w:val="22"/>
         </w:rPr>
-        <w:t>Version 1.2  ·  Single-file HTML Application</w:t>
+        <w:t>Version 1.3  ·  Single-file HTML Application</w:t>
       </w:r>
     </w:p>
     <w:p>
@@ -10067,6 +10067,70 @@
     </w:p>
     <w:p>
       <w:pPr>
+        <w:pStyle w:val="Heading2"/>
+      </w:pPr>
+      <w:r>
+        <w:t>21.7  Broken / Missing Photo Handling</w:t>
+      </w:r>
+    </w:p>
+    <w:p>
+      <w:r>
+        <w:rPr>
+          <w:rFonts w:ascii="Arial" w:hAnsi="Arial"/>
+          <w:sz w:val="22"/>
+        </w:rPr>
+        <w:t>Because photo URLs can be shared across devices (Section 18.5, 19.2, 21.5) while the underlying files live in a single GitHub repo, one device can delete a photo (Section 21.6) before another device has re-synced. Rather than surface the browser's default broken-image icon, every place a photo renders degrades gracefully:</w:t>
+      </w:r>
+    </w:p>
+    <w:p>
+      <w:pPr>
+        <w:pStyle w:val="ListBullet"/>
+        <w:ind w:left="432"/>
+      </w:pPr>
+      <w:r>
+        <w:rPr>
+          <w:rFonts w:ascii="Arial" w:hAnsi="Arial"/>
+          <w:i w:val="0"/>
+          <w:sz w:val="22"/>
+        </w:rPr>
+        <w:t>Every &lt;img&gt; rendering a photo URL — in the event form, the popover, and the Trip Summary grid — has an onerror handler that swaps in a small gray placeholder graphic (a generic "missing image" icon with a red diagonal slash) and tags the element with a photo-broken style (dashed border, slightly reduced opacity) plus a tooltip explaining the photo may have been removed from another device.</w:t>
+      </w:r>
+    </w:p>
+    <w:p>
+      <w:pPr>
+        <w:pStyle w:val="ListBullet"/>
+        <w:ind w:left="432"/>
+      </w:pPr>
+      <w:r>
+        <w:rPr>
+          <w:rFonts w:ascii="Arial" w:hAnsi="Arial"/>
+          <w:i w:val="0"/>
+          <w:sz w:val="22"/>
+        </w:rPr>
+        <w:t>The full-screen lightbox (Section 21.4) shows an explicit inline message instead of an icon ("This photo is no longer available — it may have been removed from another device"), since there is enough room to be unambiguous at that size.</w:t>
+      </w:r>
+    </w:p>
+    <w:p>
+      <w:pPr>
+        <w:pStyle w:val="ListBullet"/>
+        <w:ind w:left="432"/>
+      </w:pPr>
+      <w:r>
+        <w:rPr>
+          <w:rFonts w:ascii="Arial" w:hAnsi="Arial"/>
+          <w:i w:val="0"/>
+          <w:sz w:val="22"/>
+        </w:rPr>
+        <w:t>This handling is purely visual and never mutates the event's photos array automatically — a broken reference is left in place so the user can consciously remove it (✕ button in the event form) if they choose to, rather than having data silently rewritten. Attempting to delete an already-missing photo (Section 21.6) is a silent no-op, since ghDeleteImage's existence check simply finds nothing to delete.</w:t>
+      </w:r>
+    </w:p>
+    <w:p>
+      <w:pPr>
+        <w:spacing w:before="0" w:after="0"/>
+      </w:pPr>
+    </w:p>
+    <w:p>
+      <w:pPr>
         <w:pStyle w:val="Heading1"/>
       </w:pPr>
       <w:r>

</xml_diff>

<commit_message>
Update spec doc 2026-07-20 15:49
</commit_message>
<xml_diff>
--- a/docs/Road Trip Planner — Specification.docx
+++ b/docs/Road Trip Planner — Specification.docx
@@ -42,7 +42,7 @@
           <w:color w:val="64748B"/>
           <w:sz w:val="22"/>
         </w:rPr>
-        <w:t>Version 1.3  ·  Single-file HTML Application</w:t>
+        <w:t>Version 1.4  ·  Single-file HTML Application</w:t>
       </w:r>
     </w:p>
     <w:p>
@@ -2401,7 +2401,7 @@
                 <w:b w:val="0"/>
                 <w:sz w:val="20"/>
               </w:rPr>
-              <w:t>Array of up to 5 photo URLs (uploaded to the repo's media/ folder). See Section 21.</w:t>
+              <w:t>Array of up to 9 photo URLs (uploaded to the repo's media/ folder). See Section 21.</w:t>
             </w:r>
           </w:p>
         </w:tc>
@@ -9817,7 +9817,7 @@
           <w:rFonts w:ascii="Arial" w:hAnsi="Arial"/>
           <w:sz w:val="22"/>
         </w:rPr>
-        <w:t>Any event, in any category, can carry up to 5 photos. Photos are attached in the event edit form and shown as thumbnails in both the event popover and the Trip Summary modal, with a full-screen lightbox for viewing them at larger size.</w:t>
+        <w:t>Any event, in any category, can carry up to 9 photos. Photos are attached one at a time in the event edit form, or in bulk via the Import Photos flow (Section 23), and shown as thumbnails in both the event popover and the Trip Summary modal, with a full-screen lightbox for viewing them at larger size.</w:t>
       </w:r>
     </w:p>
     <w:p>
@@ -9839,7 +9839,7 @@
           <w:i w:val="0"/>
           <w:sz w:val="22"/>
         </w:rPr>
-        <w:t>A "Photos (up to 5)" field appears in the event form for every category, below the Description field. A "+ Add photo" button opens the device's native file picker (accept="image/*" multiple), which offers both camera roll/library and take-a-new-photo options on mobile.</w:t>
+        <w:t>A "Photos (up to 9)" field appears in the event form for every category, below the Description field. A "+ Add photo" button opens the device's native file picker (accept="image/*" multiple), which offers both camera roll/library and take-a-new-photo options on mobile.</w:t>
       </w:r>
     </w:p>
     <w:p>
@@ -9853,7 +9853,7 @@
           <w:i w:val="0"/>
           <w:sz w:val="22"/>
         </w:rPr>
-        <w:t>Selected photos appear immediately as thumbnails with an "Uploading…" overlay, then update in place once the upload completes (or show an error state on failure). Each thumbnail has its own ✕ remove button. The "+ Add photo" button hides once 5 photos are attached.</w:t>
+        <w:t>Selected photos appear immediately as thumbnails with an "Uploading…" overlay, then update in place once the upload completes (or show an error state on failure). Each thumbnail has its own ✕ remove button. The "+ Add photo" button hides once 9 photos are attached.</w:t>
       </w:r>
     </w:p>
     <w:p>
@@ -10079,7 +10079,7 @@
           <w:rFonts w:ascii="Arial" w:hAnsi="Arial"/>
           <w:sz w:val="22"/>
         </w:rPr>
-        <w:t>Because photo URLs can be shared across devices (Section 18.5, 19.2, 21.5) while the underlying files live in a single GitHub repo, one device can delete a photo (Section 21.6) before another device has re-synced. Rather than surface the browser's default broken-image icon, every place a photo renders degrades gracefully:</w:t>
+        <w:t>Because photo URLs can be shared across devices (Section 18.5, 19.2, 21.5) while the underlying files live in a single GitHub repo, one device can delete a photo (Section 21.6) before another device has re-synced. Rather than show any broken-image placeholder or error message, every place a photo renders removes a broken reference silently and completely:</w:t>
       </w:r>
     </w:p>
     <w:p>
@@ -10093,7 +10093,7 @@
           <w:i w:val="0"/>
           <w:sz w:val="22"/>
         </w:rPr>
-        <w:t>Every &lt;img&gt; rendering a photo URL — in the event form, the popover, and the Trip Summary grid — has an onerror handler that swaps in a small gray placeholder graphic (a generic "missing image" icon with a red diagonal slash) and tags the element with a photo-broken style (dashed border, slightly reduced opacity) plus a tooltip explaining the photo may have been removed from another device.</w:t>
+        <w:t>Every &lt;img&gt; rendering a photo URL — in the event form, the popover, and the Trip Summary grid — has an onerror handler (hideBrokenPhotoThumb()) that removes the thumbnail element from the DOM entirely (or its enclosing card, in the event form, so the ✕ remove button disappears with it) and collapses the surrounding container if that was its only photo. No placeholder icon, dashed border, or tooltip is shown — visually, it is as if the photo was never there.</w:t>
       </w:r>
     </w:p>
     <w:p>
@@ -10107,7 +10107,7 @@
           <w:i w:val="0"/>
           <w:sz w:val="22"/>
         </w:rPr>
-        <w:t>The full-screen lightbox (Section 21.4) shows an explicit inline message instead of an icon ("This photo is no longer available — it may have been removed from another device"), since there is enough room to be unambiguous at that size.</w:t>
+        <w:t>The full-screen lightbox (Section 21.4) keeps its own working copy of the current event's photo list when it opens. If the photo currently being viewed fails to load, it is spliced out of that local copy — never out of the event's actual photos array — and the view silently advances to the next photo, or closes the lightbox if none remain.</w:t>
       </w:r>
     </w:p>
     <w:p>
@@ -10121,7 +10121,7 @@
           <w:i w:val="0"/>
           <w:sz w:val="22"/>
         </w:rPr>
-        <w:t>This handling is purely visual and never mutates the event's photos array automatically — a broken reference is left in place so the user can consciously remove it (✕ button in the event form) if they choose to, rather than having data silently rewritten. Attempting to delete an already-missing photo (Section 21.6) is a silent no-op, since ghDeleteImage's existence check simply finds nothing to delete.</w:t>
+        <w:t>This handling is purely visual and never mutates the event's photos array automatically — a broken reference is left in the data so the user can consciously remove it (✕ button in the event form) if they choose to, rather than having data silently rewritten. Attempting to delete an already-missing photo (Section 21.6) is a silent no-op, since ghDeleteImage's existence check simply finds nothing to delete.</w:t>
       </w:r>
     </w:p>
     <w:p>
@@ -10261,6 +10261,230 @@
           <w:sz w:val="22"/>
         </w:rPr>
         <w:t>The GitHub Sync "Load" flow (Section 18.3) and the manual CSV "Import" flow (Section 13.2) are separate code paths with independent CSV parsers; any new column added to the CSV format (e.g. photos) must be wired into both, or data silently fails to round-trip through one of the two paths.</w:t>
+      </w:r>
+    </w:p>
+    <w:p>
+      <w:pPr>
+        <w:spacing w:before="0" w:after="0"/>
+      </w:pPr>
+    </w:p>
+    <w:p>
+      <w:pPr>
+        <w:pStyle w:val="Heading1"/>
+      </w:pPr>
+      <w:r>
+        <w:t>23. Bulk Photo Import</w:t>
+      </w:r>
+    </w:p>
+    <w:p>
+      <w:pPr>
+        <w:pStyle w:val="Heading2"/>
+      </w:pPr>
+      <w:r>
+        <w:t>23.1  Purpose</w:t>
+      </w:r>
+    </w:p>
+    <w:p>
+      <w:r>
+        <w:rPr>
+          <w:rFonts w:ascii="Arial" w:hAnsi="Arial"/>
+          <w:sz w:val="22"/>
+        </w:rPr>
+        <w:t>Manually attaching photos one event at a time (Section 21.2) doesn't scale once a trip has accumulated dozens or hundreds of camera-roll photos with no obvious link back to which event they belong to. The Import Photos flow, opened from a button in the Trip Summary header (Section 14), lets the user pick a large batch of photos at once; each one is matched to the closest event automatically by comparing its EXIF capture date and GPS location against every event's time window and location, so only the handful of genuinely ambiguous photos ever need a manual decision.</w:t>
+      </w:r>
+    </w:p>
+    <w:p>
+      <w:pPr>
+        <w:pStyle w:val="Heading2"/>
+      </w:pPr>
+      <w:r>
+        <w:t>23.2  Reading Photo Metadata</w:t>
+      </w:r>
+    </w:p>
+    <w:p>
+      <w:pPr>
+        <w:pStyle w:val="ListBullet"/>
+        <w:ind w:left="432"/>
+      </w:pPr>
+      <w:r>
+        <w:rPr>
+          <w:rFonts w:ascii="Arial" w:hAnsi="Arial"/>
+          <w:i w:val="0"/>
+          <w:sz w:val="22"/>
+        </w:rPr>
+        <w:t>Each selected file's EXIF data (capture date/time and GPS coordinates, if present) is read client-side via the exifr library before the photo is resized (resizing strips EXIF). If a photo has no EXIF date at all, the file's own last-modified time is used instead as a much less reliable fallback, and is labeled as such during manual review.</w:t>
+      </w:r>
+    </w:p>
+    <w:p>
+      <w:pPr>
+        <w:pStyle w:val="ListBullet"/>
+        <w:ind w:left="432"/>
+      </w:pPr>
+      <w:r>
+        <w:rPr>
+          <w:rFonts w:ascii="Arial" w:hAnsi="Arial"/>
+          <w:i w:val="0"/>
+          <w:sz w:val="22"/>
+        </w:rPr>
+        <w:t>Event coordinates are derived the same way the route maps are (Section 20): sleeping/dining/sightseeing events geocode their own address field; driving legs use the midpoint of the geocoded departure and arrival addresses. The geocode cache (Section 20.3) is reused and pre-warmed for every event in the trip before the first photo is scored, so only the very first import in a session pays the geocoding cost.</w:t>
+      </w:r>
+    </w:p>
+    <w:p>
+      <w:pPr>
+        <w:pStyle w:val="Heading2"/>
+      </w:pPr>
+      <w:r>
+        <w:t>23.3  Confidence Scoring</w:t>
+      </w:r>
+    </w:p>
+    <w:p>
+      <w:pPr>
+        <w:pStyle w:val="ListBullet"/>
+        <w:ind w:left="432"/>
+      </w:pPr>
+      <w:r>
+        <w:rPr>
+          <w:rFonts w:ascii="Arial" w:hAnsi="Arial"/>
+          <w:i w:val="0"/>
+          <w:sz w:val="22"/>
+        </w:rPr>
+        <w:t>Each photo is scored against every event in the trip on three factors, combined into a single 0-1 score: a time score (1.0 inside the event's start/end window padded by a category-specific number of hours — 3h for sightseeing/sleeping, 2h for driving/dining/transportation, 1h for working/blocked — fading to 0 over 3 additional hours beyond that); a location score (1.0 within 0.5 miles of the event's coordinate, fading to 0 by 10 miles, or a neutral 0.6 if either the photo or the event has no GPS data); and a category weight (sightseeing and sleeping are weighted highest, since they're the most likely to have photos actually taken during them, driving legs lowest).</w:t>
+      </w:r>
+    </w:p>
+    <w:p>
+      <w:pPr>
+        <w:pStyle w:val="ListBullet"/>
+        <w:ind w:left="432"/>
+      </w:pPr>
+      <w:r>
+        <w:rPr>
+          <w:rFonts w:ascii="Arial" w:hAnsi="Arial"/>
+          <w:i w:val="0"/>
+          <w:sz w:val="22"/>
+        </w:rPr>
+        <w:t>A photo commits automatically to its top-scoring event when that score is at least 0.6 and leads the second-best event by at least 0.15 — anything less confident is left for manual review rather than guessing between two nearby, same-day events.</w:t>
+      </w:r>
+    </w:p>
+    <w:p>
+      <w:pPr>
+        <w:pStyle w:val="ListBullet"/>
+        <w:ind w:left="432"/>
+      </w:pPr>
+      <w:r>
+        <w:rPr>
+          <w:rFonts w:ascii="Arial" w:hAnsi="Arial"/>
+          <w:i w:val="0"/>
+          <w:sz w:val="22"/>
+        </w:rPr>
+        <w:t>If an event's 9-photo limit (Section 21.1) is already full when a confident match would otherwise have committed, that photo falls through to manual review instead ("overflow") so the user can decide which photos to keep.</w:t>
+      </w:r>
+    </w:p>
+    <w:p>
+      <w:pPr>
+        <w:pStyle w:val="Heading2"/>
+      </w:pPr>
+      <w:r>
+        <w:t>23.4  Staging Folder &amp; Resumability</w:t>
+      </w:r>
+    </w:p>
+    <w:p>
+      <w:pPr>
+        <w:pStyle w:val="ListBullet"/>
+        <w:ind w:left="432"/>
+      </w:pPr>
+      <w:r>
+        <w:rPr>
+          <w:rFonts w:ascii="Arial" w:hAnsi="Arial"/>
+          <w:i w:val="0"/>
+          <w:sz w:val="22"/>
+        </w:rPr>
+        <w:t>Every selected photo is resized and uploaded (Section 21.3) to a temporary media/_import_staging/{trip-name}/ folder in the repo first — never directly to an event. Only once a match is confirmed (automatically or manually) is the photo moved into its event's photo list: the same bytes are written to the final media/{filename}.jpg path and the staged copy is deleted (ghCommitStagedPhoto()), so a committed photo ends up in exactly the same place a manually-attached one would.</w:t>
+      </w:r>
+    </w:p>
+    <w:p>
+      <w:pPr>
+        <w:pStyle w:val="ListBullet"/>
+        <w:ind w:left="432"/>
+      </w:pPr>
+      <w:r>
+        <w:rPr>
+          <w:rFonts w:ascii="Arial" w:hAnsi="Arial"/>
+          <w:i w:val="0"/>
+          <w:sz w:val="22"/>
+        </w:rPr>
+        <w:t>A photo that's discarded during review, or whose event is never decided, is deleted from the staging folder outright (ghDiscardStagedPhoto()) rather than left orphaned.</w:t>
+      </w:r>
+    </w:p>
+    <w:p>
+      <w:pPr>
+        <w:pStyle w:val="ListBullet"/>
+        <w:ind w:left="432"/>
+      </w:pPr>
+      <w:r>
+        <w:rPr>
+          <w:rFonts w:ascii="Arial" w:hAnsi="Arial"/>
+          <w:i w:val="0"/>
+          <w:sz w:val="22"/>
+        </w:rPr>
+        <w:t>The list of not-yet-committed photos (their EXIF metadata, staging URL, and candidate matches) is kept in a per-trip queue in localStorage, and mirrored as a small JSON file on GitHub whenever it changes. This means the review can be closed and picked back up later — even from a different device or browser — and the queue being empty is exactly the signal that nothing is left to review. Deleting a trip discards its entire queue and every staged photo in it.</w:t>
+      </w:r>
+    </w:p>
+    <w:p>
+      <w:pPr>
+        <w:pStyle w:val="Heading2"/>
+      </w:pPr>
+      <w:r>
+        <w:t>23.5  Manual Review</w:t>
+      </w:r>
+    </w:p>
+    <w:p>
+      <w:pPr>
+        <w:pStyle w:val="ListBullet"/>
+        <w:ind w:left="432"/>
+      </w:pPr>
+      <w:r>
+        <w:rPr>
+          <w:rFonts w:ascii="Arial" w:hAnsi="Arial"/>
+          <w:i w:val="0"/>
+          <w:sz w:val="22"/>
+        </w:rPr>
+        <w:t>Photos that aren't auto-committed appear in a review list inside the Import Photos panel, each showing its thumbnail, capture date (flagged if it's a file-date fallback rather than real EXIF), and a dropdown of candidate events — the top-scoring suggestions grouped above the full event list, with the best guess pre-selected for anything that already has one.</w:t>
+      </w:r>
+    </w:p>
+    <w:p>
+      <w:pPr>
+        <w:pStyle w:val="ListBullet"/>
+        <w:ind w:left="432"/>
+      </w:pPr>
+      <w:r>
+        <w:rPr>
+          <w:rFonts w:ascii="Arial" w:hAnsi="Arial"/>
+          <w:i w:val="0"/>
+          <w:sz w:val="22"/>
+        </w:rPr>
+        <w:t>"Assign" commits the photo to whichever event is selected in the dropdown (warning first if that event is already at the 9-photo limit); "Discard" deletes the staged photo entirely; "New event from photo" opens the ordinary new-event form pre-filled with the photo's capture date and, if the photo has GPS data, a reverse-geocoded address suggestion for the Sightseeing address field — saving that new event automatically attaches the photo to it.</w:t>
+      </w:r>
+    </w:p>
+    <w:p>
+      <w:pPr>
+        <w:pStyle w:val="Heading2"/>
+      </w:pPr>
+      <w:r>
+        <w:t>23.6  Duplicate Detection</w:t>
+      </w:r>
+    </w:p>
+    <w:p>
+      <w:pPr>
+        <w:pStyle w:val="ListBullet"/>
+        <w:ind w:left="432"/>
+      </w:pPr>
+      <w:r>
+        <w:rPr>
+          <w:rFonts w:ascii="Arial" w:hAnsi="Arial"/>
+          <w:i w:val="0"/>
+          <w:sz w:val="22"/>
+        </w:rPr>
+        <w:t>Before uploading anything, each selected file's content is hashed (SHA-256, computed from the original file bytes before resizing) and checked against every photo already attached to the trip (recorded at commit time, whether via bulk import or the single-event form) and against photos already sitting in the pending queue. A match means the exact same original photo has already been imported, so it's skipped silently — re-running an import over an overlapping camera-roll selection never re-uploads or double-attaches the same photo.</w:t>
       </w:r>
     </w:p>
     <w:p>

</xml_diff>

<commit_message>
Update spec doc 2026-07-20 16:23
</commit_message>
<xml_diff>
--- a/docs/Road Trip Planner — Specification.docx
+++ b/docs/Road Trip Planner — Specification.docx
@@ -42,7 +42,7 @@
           <w:color w:val="64748B"/>
           <w:sz w:val="22"/>
         </w:rPr>
-        <w:t>Version 1.4  ·  Single-file HTML Application</w:t>
+        <w:t>Version 1.5  ·  Single-file HTML Application</w:t>
       </w:r>
     </w:p>
     <w:p>
@@ -3436,6 +3436,20 @@
           <w:i w:val="0"/>
           <w:sz w:val="22"/>
         </w:rPr>
+        <w:t>📷 Import Photos (SVG camera icon) — opens the bulk photo import panel for this trip (Section 23). Shows a small red count badge when photos are waiting for review.</w:t>
+      </w:r>
+    </w:p>
+    <w:p>
+      <w:pPr>
+        <w:pStyle w:val="ListBullet"/>
+        <w:ind w:left="792"/>
+      </w:pPr>
+      <w:r>
+        <w:rPr>
+          <w:rFonts w:ascii="Arial" w:hAnsi="Arial"/>
+          <w:i w:val="0"/>
+          <w:sz w:val="22"/>
+        </w:rPr>
         <w:t>⬇ Export — downloads a CSV of the trip's events.</w:t>
       </w:r>
     </w:p>
@@ -10290,7 +10304,7 @@
           <w:rFonts w:ascii="Arial" w:hAnsi="Arial"/>
           <w:sz w:val="22"/>
         </w:rPr>
-        <w:t>Manually attaching photos one event at a time (Section 21.2) doesn't scale once a trip has accumulated dozens or hundreds of camera-roll photos with no obvious link back to which event they belong to. The Import Photos flow, opened from a button in the Trip Summary header (Section 14), lets the user pick a large batch of photos at once; each one is matched to the closest event automatically by comparing its EXIF capture date and GPS location against every event's time window and location, so only the handful of genuinely ambiguous photos ever need a manual decision.</w:t>
+        <w:t>Manually attaching photos one event at a time (Section 21.2) doesn't scale once a trip has accumulated dozens or hundreds of camera-roll photos with no obvious link back to which event they belong to. The Import Photos flow, opened from the 📷 icon in each trip's action row (Section 5.2), lets the user pick a large batch of photos at once; each one is scored against every event by comparing its EXIF capture date and GPS location against that event's time window and location, and the closest match is pre-selected as a suggestion — but every single photo still waits for the user to explicitly confirm it before it's attached to anything, so nothing is ever added to an event automatically.</w:t>
       </w:r>
     </w:p>
     <w:p>
@@ -10362,7 +10376,7 @@
           <w:i w:val="0"/>
           <w:sz w:val="22"/>
         </w:rPr>
-        <w:t>A photo commits automatically to its top-scoring event when that score is at least 0.6 and leads the second-best event by at least 0.15 — anything less confident is left for manual review rather than guessing between two nearby, same-day events.</w:t>
+        <w:t>A photo whose top-scoring event reaches at least 0.6 and leads the second-best event by at least 0.15 is labeled a "confident" suggestion, shown at the top of the review list with that event pre-selected in its dropdown; anything less confident is labeled "ambiguous" instead. Either way, the score only ever produces a suggestion — the photo is not attached to any event until the user taps Assign (Section 23.5).</w:t>
       </w:r>
     </w:p>
     <w:p>
@@ -10376,7 +10390,7 @@
           <w:i w:val="0"/>
           <w:sz w:val="22"/>
         </w:rPr>
-        <w:t>If an event's 9-photo limit (Section 21.1) is already full when a confident match would otherwise have committed, that photo falls through to manual review instead ("overflow") so the user can decide which photos to keep.</w:t>
+        <w:t>If the event chosen when a photo is assigned already has 9 photos (Section 21.1), a confirmation prompt warns the user before adding one beyond the limit, rather than blocking the assignment outright.</w:t>
       </w:r>
     </w:p>
     <w:p>
@@ -10398,7 +10412,7 @@
           <w:i w:val="0"/>
           <w:sz w:val="22"/>
         </w:rPr>
-        <w:t>Every selected photo is resized and uploaded (Section 21.3) to a temporary media/_import_staging/{trip-name}/ folder in the repo first — never directly to an event. Only once a match is confirmed (automatically or manually) is the photo moved into its event's photo list: the same bytes are written to the final media/{filename}.jpg path and the staged copy is deleted (ghCommitStagedPhoto()), so a committed photo ends up in exactly the same place a manually-attached one would.</w:t>
+        <w:t>Every selected photo is resized and uploaded (Section 21.3) to a temporary media/_import_staging/{trip-name}/ folder in the repo first — never directly to an event. Only once the user confirms a match (Section 23.5) is the photo moved into its event's photo list: the same bytes are written to the final media/{filename}.jpg path and the staged copy is deleted (ghCommitStagedPhoto()), so a committed photo ends up in exactly the same place a manually-attached one would.</w:t>
       </w:r>
     </w:p>
     <w:p>
@@ -10448,7 +10462,7 @@
           <w:i w:val="0"/>
           <w:sz w:val="22"/>
         </w:rPr>
-        <w:t>Photos that aren't auto-committed appear in a review list inside the Import Photos panel, each showing its thumbnail, capture date (flagged if it's a file-date fallback rather than real EXIF), and a dropdown of candidate events — the top-scoring suggestions grouped above the full event list, with the best guess pre-selected for anything that already has one.</w:t>
+        <w:t>Every imported photo appears in a review list inside the Import Photos panel — none are attached automatically. The list is split into "Suggested matches" (confident scores, Section 23.3, with the top event already pre-selected — a one-tap confirm) and "Needs a closer look" (ambiguous matches, no match at all, or an upload error). Each entry shows its thumbnail, capture date (flagged if it's a file-date fallback rather than real EXIF), and a dropdown of candidate events, with the top-scoring suggestions grouped above the full event list.</w:t>
       </w:r>
     </w:p>
     <w:p>

</xml_diff>

<commit_message>
Update spec doc 2026-07-20 22:39
</commit_message>
<xml_diff>
--- a/docs/Road Trip Planner — Specification.docx
+++ b/docs/Road Trip Planner — Specification.docx
@@ -42,7 +42,7 @@
           <w:color w:val="64748B"/>
           <w:sz w:val="22"/>
         </w:rPr>
-        <w:t>Version 1.5  ·  Single-file HTML Application</w:t>
+        <w:t>Version 1.6  ·  Single-file HTML Application</w:t>
       </w:r>
     </w:p>
     <w:p>
@@ -10304,7 +10304,7 @@
           <w:rFonts w:ascii="Arial" w:hAnsi="Arial"/>
           <w:sz w:val="22"/>
         </w:rPr>
-        <w:t>Manually attaching photos one event at a time (Section 21.2) doesn't scale once a trip has accumulated dozens or hundreds of camera-roll photos with no obvious link back to which event they belong to. The Import Photos flow, opened from the 📷 icon in each trip's action row (Section 5.2), lets the user pick a large batch of photos at once; each one is scored against every event by comparing its EXIF capture date and GPS location against that event's time window and location, and the closest match is pre-selected as a suggestion — but every single photo still waits for the user to explicitly confirm it before it's attached to anything, so nothing is ever added to an event automatically.</w:t>
+        <w:t>Manually attaching photos one event at a time (Section 21.2) doesn't scale once a trip has accumulated dozens or hundreds of camera-roll photos with no obvious link back to which event they belong to. The Import Photos flow, opened from the 📷 icon in each trip's action row (Section 5.2), lets the user pick a large batch of photos at once; each one is scored against every event by comparing its EXIF capture date and GPS location against that event's time window and location, and the closest match is pre-selected as a suggestion — but every single photo still waits for the user to explicitly confirm it before it's attached to anything, so nothing is ever added to an event automatically. Batches are capped at 50 photos at a time — larger batches can appear to stall while iOS downloads full-resolution originals from iCloud one at a time — and each photo has its own processing ceiling so a single slow download can't block the rest of the batch.</w:t>
       </w:r>
     </w:p>
     <w:p>
@@ -10362,7 +10362,7 @@
           <w:i w:val="0"/>
           <w:sz w:val="22"/>
         </w:rPr>
-        <w:t>Each photo is scored against every event in the trip on three factors, combined into a single 0-1 score: a time score (1.0 inside the event's start/end window padded by a category-specific number of hours — 3h for sightseeing/sleeping, 2h for driving/dining/transportation, 1h for working/blocked — fading to 0 over 3 additional hours beyond that); a location score (1.0 within 0.5 miles of the event's coordinate, fading to 0 by 10 miles, or a neutral 0.6 if either the photo or the event has no GPS data); and a category weight (sightseeing and sleeping are weighted highest, since they're the most likely to have photos actually taken during them, driving legs lowest).</w:t>
+        <w:t>Each photo is scored against every event in the trip on four factors, combined into a single 0-1 score: a time score (1.0 inside the event's start/end window padded by a category-specific number of hours — 3h for sightseeing/sleeping, 2h for driving/dining/transportation, 1h for working/blocked — fading to 0 over 3 additional hours beyond that); a location score (1.0 within 0.5 miles of the event's coordinate, fading to 0 by 10 miles, or a neutral 0.6 if either the photo or the event has no GPS data); a category weight (sightseeing and sleeping are weighted highest, since they're the most likely to have photos actually taken during them, driving legs lowest); and a reliability multiplier (Section 23.8) that discounts photos whose metadata looks untrustworthy — e.g. a re-shared WhatsApp/Messages copy with no GPS and a suspiciously small file size.</w:t>
       </w:r>
     </w:p>
     <w:p>
@@ -10376,7 +10376,15 @@
           <w:i w:val="0"/>
           <w:sz w:val="22"/>
         </w:rPr>
-        <w:t>A photo whose top-scoring event reaches at least 0.6 and leads the second-best event by at least 0.15 is labeled a "confident" suggestion, shown at the top of the review list with that event pre-selected in its dropdown; anything less confident is labeled "ambiguous" instead. Either way, the score only ever produces a suggestion — the photo is not attached to any event until the user taps Assign (Section 23.5).</w:t>
+        <w:t>A photo whose top-scoring event reaches at least 0.6 and leads the second-best event by at least 0.15 is labeled a "confident" suggestion, shown at the top of the review list with that event pre-selected in its dropdown; a top score below 0.25 is labeled "unmatched" (no candidate is close enough to suggest at all); anything in between is labeled "ambiguous." Either way, the score only ever produces a suggestion — the photo is not attached to any event until the user taps Assign (Section 23.6).</w:t>
+      </w:r>
+    </w:p>
+    <w:p>
+      <w:pPr>
+        <w:pStyle w:val="Heading2"/>
+      </w:pPr>
+      <w:r>
+        <w:t>23.4  Staging Folder &amp; Resumability</w:t>
       </w:r>
     </w:p>
     <w:p>
@@ -10390,29 +10398,7 @@
           <w:i w:val="0"/>
           <w:sz w:val="22"/>
         </w:rPr>
-        <w:t>If the event chosen when a photo is assigned already has 9 photos (Section 21.1), a confirmation prompt warns the user before adding one beyond the limit, rather than blocking the assignment outright.</w:t>
-      </w:r>
-    </w:p>
-    <w:p>
-      <w:pPr>
-        <w:pStyle w:val="Heading2"/>
-      </w:pPr>
-      <w:r>
-        <w:t>23.4  Staging Folder &amp; Resumability</w:t>
-      </w:r>
-    </w:p>
-    <w:p>
-      <w:pPr>
-        <w:pStyle w:val="ListBullet"/>
-        <w:ind w:left="432"/>
-      </w:pPr>
-      <w:r>
-        <w:rPr>
-          <w:rFonts w:ascii="Arial" w:hAnsi="Arial"/>
-          <w:i w:val="0"/>
-          <w:sz w:val="22"/>
-        </w:rPr>
-        <w:t>Every selected photo is resized and uploaded (Section 21.3) to a temporary media/_import_staging/{trip-name}/ folder in the repo first — never directly to an event. Only once the user confirms a match (Section 23.5) is the photo moved into its event's photo list: the same bytes are written to the final media/{filename}.jpg path and the staged copy is deleted (ghCommitStagedPhoto()), so a committed photo ends up in exactly the same place a manually-attached one would.</w:t>
+        <w:t>Every selected photo is resized and uploaded (Section 21.3) to a temporary media/_import_staging/{trip-name}/ folder in the repo first — never directly to an event. Only once the user confirms a match (Section 23.6) is the photo moved into its event's photo list: the same bytes are written to the final media/{filename}.jpg path and the staged copy is deleted (ghCommitStagedPhoto()), so a committed photo ends up in exactly the same place a manually-attached one would.</w:t>
       </w:r>
     </w:p>
     <w:p>
@@ -10445,14 +10431,6 @@
     </w:p>
     <w:p>
       <w:pPr>
-        <w:pStyle w:val="Heading2"/>
-      </w:pPr>
-      <w:r>
-        <w:t>23.5  Manual Review</w:t>
-      </w:r>
-    </w:p>
-    <w:p>
-      <w:pPr>
         <w:pStyle w:val="ListBullet"/>
         <w:ind w:left="432"/>
       </w:pPr>
@@ -10462,7 +10440,7 @@
           <w:i w:val="0"/>
           <w:sz w:val="22"/>
         </w:rPr>
-        <w:t>Every imported photo appears in a review list inside the Import Photos panel — none are attached automatically. The list is split into "Suggested matches" (confident scores, Section 23.3, with the top event already pre-selected — a one-tap confirm) and "Needs a closer look" (ambiguous matches, no match at all, or an upload error). Each entry shows its thumbnail, capture date (flagged if it's a file-date fallback rather than real EXIF), and a dropdown of candidate events, with the top-scoring suggestions grouped above the full event list.</w:t>
+        <w:t>Every GitHub write in this pipeline (staging upload, committing to media/, deleting a staged or replaced file) re-fetches the target path's current sha immediately before writing, and automatically retries once if GitHub reports a sha conflict rather than surfacing a raw API error. Committing a photo is also idempotent: if the final file already exists with identical content, the write is skipped instead of re-uploaded — this makes it safe to retry a commit after a partial failure without duplicating or corrupting anything.</w:t>
       </w:r>
     </w:p>
     <w:p>
@@ -10476,7 +10454,7 @@
           <w:i w:val="0"/>
           <w:sz w:val="22"/>
         </w:rPr>
-        <w:t>"Assign" commits the photo to whichever event is selected in the dropdown (warning first if that event is already at the 9-photo limit); "Discard" deletes the staged photo entirely; "New event from photo" opens the ordinary new-event form pre-filled with the photo's capture date and, if the photo has GPS data, a reverse-geocoded address suggestion for the Sightseeing address field — saving that new event automatically attaches the photo to it.</w:t>
+        <w:t>A photo committed on one device can take a short while to propagate through GitHub's raw-content CDN before it's visible on another device resuming the same review. If a review thumbnail fails to load, it's retried automatically with increasing delays (1.5s, 3s, 6s, 10s); if it still hasn't appeared after all four attempts, a friendly note explains that the photo is still syncing and to check back shortly, rather than showing a broken-image icon.</w:t>
       </w:r>
     </w:p>
     <w:p>
@@ -10484,7 +10462,7 @@
         <w:pStyle w:val="Heading2"/>
       </w:pPr>
       <w:r>
-        <w:t>23.6  Duplicate Detection</w:t>
+        <w:t>23.5  Replacing a Photo at the 9-Photo Cap</w:t>
       </w:r>
     </w:p>
     <w:p>
@@ -10498,7 +10476,165 @@
           <w:i w:val="0"/>
           <w:sz w:val="22"/>
         </w:rPr>
-        <w:t>Before uploading anything, each selected file's content is hashed (SHA-256, computed from the original file bytes before resizing) and checked against every photo already attached to the trip (recorded at commit time, whether via bulk import or the single-event form) and against photos already sitting in the pending queue. A match means the exact same original photo has already been imported, so it's skipped silently — re-running an import over an overlapping camera-roll selection never re-uploads or double-attaches the same photo.</w:t>
+        <w:t>If the event selected when a photo is assigned already has 9 photos (Section 21.1), Assign opens a replacement picker showing all 9 existing photos on that event instead of a blind "add anyway?" confirmation. The user taps the one they want to swap out; the new photo takes its place on the event and the replaced photo is deleted from GitHub. Cancelling the picker leaves both the event and the pending photo untouched.</w:t>
+      </w:r>
+    </w:p>
+    <w:p>
+      <w:pPr>
+        <w:pStyle w:val="Heading2"/>
+      </w:pPr>
+      <w:r>
+        <w:t>23.6  Manual Review</w:t>
+      </w:r>
+    </w:p>
+    <w:p>
+      <w:pPr>
+        <w:pStyle w:val="ListBullet"/>
+        <w:ind w:left="432"/>
+      </w:pPr>
+      <w:r>
+        <w:rPr>
+          <w:rFonts w:ascii="Arial" w:hAnsi="Arial"/>
+          <w:i w:val="0"/>
+          <w:sz w:val="22"/>
+        </w:rPr>
+        <w:t>Every imported photo appears in a review list inside the Import Photos panel — none are attached automatically. The list is split into two top-level sections: photos with a real EXIF capture date first, and photos without one (file-date fallback or no date at all) in a separate "Photos without date info" section at the bottom, since those matches are inherently less trustworthy. A "Discard all" button sits at the top of that second section for clearing it in one action, with a confirmation prompt since it can't be undone.</w:t>
+      </w:r>
+    </w:p>
+    <w:p>
+      <w:pPr>
+        <w:pStyle w:val="ListBullet"/>
+        <w:ind w:left="432"/>
+      </w:pPr>
+      <w:r>
+        <w:rPr>
+          <w:rFonts w:ascii="Arial" w:hAnsi="Arial"/>
+          <w:i w:val="0"/>
+          <w:sz w:val="22"/>
+        </w:rPr>
+        <w:t>Within each of those two sections, entries are further grouped into "Suggested matches" (confident scores, Section 23.3, with the top event already pre-selected — a one-tap confirm), "Needs a closer look" (ambiguous matches, no match at all, or an upload error), and "Likely duplicates" (Section 23.7). Each entry shows its thumbnail (click to view full-screen), capture date (flagged if it's a file-date fallback), GPS presence and file size, and a dropdown of candidate events with the top-scoring suggestions grouped above the full event list.</w:t>
+      </w:r>
+    </w:p>
+    <w:p>
+      <w:pPr>
+        <w:pStyle w:val="ListBullet"/>
+        <w:ind w:left="432"/>
+      </w:pPr>
+      <w:r>
+        <w:rPr>
+          <w:rFonts w:ascii="Arial" w:hAnsi="Arial"/>
+          <w:i w:val="0"/>
+          <w:sz w:val="22"/>
+        </w:rPr>
+        <w:t>"Assign" commits the photo to whichever event is selected in the dropdown (opening the replacement picker, Section 23.5, if that event is already at the 9-photo limit); "Discard" deletes the staged photo entirely. There is no "create a new event from this photo" option — every photo is assigned to an existing event or discarded.</w:t>
+      </w:r>
+    </w:p>
+    <w:p>
+      <w:pPr>
+        <w:pStyle w:val="Heading2"/>
+      </w:pPr>
+      <w:r>
+        <w:t>23.7  Duplicate Detection</w:t>
+      </w:r>
+    </w:p>
+    <w:p>
+      <w:pPr>
+        <w:pStyle w:val="ListBullet"/>
+        <w:ind w:left="432"/>
+      </w:pPr>
+      <w:r>
+        <w:rPr>
+          <w:rFonts w:ascii="Arial" w:hAnsi="Arial"/>
+          <w:i w:val="0"/>
+          <w:sz w:val="22"/>
+        </w:rPr>
+        <w:t>Before uploading anything, each selected file's content is hashed (SHA-256, computed from the original file bytes before resizing) and checked against every photo already attached to the trip (recorded at commit time, whether via bulk import or the single-event form) and against every other photo already selected earlier in the same batch. A match means the exact same original file has already been imported.</w:t>
+      </w:r>
+    </w:p>
+    <w:p>
+      <w:pPr>
+        <w:pStyle w:val="ListBullet"/>
+        <w:ind w:left="432"/>
+      </w:pPr>
+      <w:r>
+        <w:rPr>
+          <w:rFonts w:ascii="Arial" w:hAnsi="Arial"/>
+          <w:i w:val="0"/>
+          <w:sz w:val="22"/>
+        </w:rPr>
+        <w:t>A detected duplicate is not skipped silently — it appears in the review list under "Likely duplicates — discard suggested," using only a lightweight local preview rather than uploading it to staging. Discard is the emphasized action for these entries. Assigning a duplicate of an already-committed photo reuses that photo's existing URL instead of re-uploading it; a duplicate of another photo still pending earlier in the same batch can only be discarded, since there's nothing to attach until the earlier copy itself is resolved.</w:t>
+      </w:r>
+    </w:p>
+    <w:p>
+      <w:pPr>
+        <w:pStyle w:val="Heading2"/>
+      </w:pPr>
+      <w:r>
+        <w:t>23.8  Reliability Scoring &amp; Quality Warnings</w:t>
+      </w:r>
+    </w:p>
+    <w:p>
+      <w:pPr>
+        <w:pStyle w:val="ListBullet"/>
+        <w:ind w:left="432"/>
+      </w:pPr>
+      <w:r>
+        <w:rPr>
+          <w:rFonts w:ascii="Arial" w:hAnsi="Arial"/>
+          <w:i w:val="0"/>
+          <w:sz w:val="22"/>
+        </w:rPr>
+        <w:t>Photos re-shared through WhatsApp, Messages, or similar apps often keep an altered timestamp and lose their GPS data entirely, which was producing confident-looking but wrong event matches. Each photo gets a reliability multiplier applied to its score (Section 23.3): 1.0 if it has GPS data, 0.8 if it lacks GPS but is a normal camera-photo file size, and 0.45 if it lacks GPS and is under 400KB — the combination most typical of a re-compressed, re-shared copy.</w:t>
+      </w:r>
+    </w:p>
+    <w:p>
+      <w:pPr>
+        <w:pStyle w:val="ListBullet"/>
+        <w:ind w:left="432"/>
+      </w:pPr>
+      <w:r>
+        <w:rPr>
+          <w:rFonts w:ascii="Arial" w:hAnsi="Arial"/>
+          <w:i w:val="0"/>
+          <w:sz w:val="22"/>
+        </w:rPr>
+        <w:t>Whenever a photo's reliability is discounted for lacking GPS and being unusually small, its review entry (Section 23.6) shows an amber warning banner explaining exactly why — e.g. "no GPS data and only 180KB, much smaller than a native camera photo" — so the user can judge the match for themselves rather than trusting a silent score.</w:t>
+      </w:r>
+    </w:p>
+    <w:p>
+      <w:pPr>
+        <w:pStyle w:val="Heading2"/>
+      </w:pPr>
+      <w:r>
+        <w:t>23.9  Resilience &amp; Error Recovery</w:t>
+      </w:r>
+    </w:p>
+    <w:p>
+      <w:pPr>
+        <w:pStyle w:val="ListBullet"/>
+        <w:ind w:left="432"/>
+      </w:pPr>
+      <w:r>
+        <w:rPr>
+          <w:rFonts w:ascii="Arial" w:hAnsi="Arial"/>
+          <w:i w:val="0"/>
+          <w:sz w:val="22"/>
+        </w:rPr>
+        <w:t>Assigning or replacing a photo has its own 30-second ceiling; if the GitHub save call hangs, the entry falls back to an error state instead of staying stuck forever. While a save is in progress the entry shows in a visible "Saving…" row (rather than disappearing from the list), with a "Taking too long? Reset" button that returns it to a reviewable state if something does go wrong — closing a bug where a hung save could leave the entire review panel unresponsive to both Assign and Discard on every other photo.</w:t>
+      </w:r>
+    </w:p>
+    <w:p>
+      <w:pPr>
+        <w:pStyle w:val="ListBullet"/>
+        <w:ind w:left="432"/>
+      </w:pPr>
+      <w:r>
+        <w:rPr>
+          <w:rFonts w:ascii="Arial" w:hAnsi="Arial"/>
+          <w:i w:val="0"/>
+          <w:sz w:val="22"/>
+        </w:rPr>
+        <w:t>Each review entry renders defensively: if a single photo's data is ever malformed in a way that would otherwise throw an error and abort the whole list, that entry falls back to a plain "Couldn't display this photo" card with just a Discard button, so one bad entry can never take down the rest of the review.</w:t>
       </w:r>
     </w:p>
     <w:p>

</xml_diff>

<commit_message>
Update spec doc 2026-07-22 17:41
</commit_message>
<xml_diff>
--- a/docs/Road Trip Planner — Specification.docx
+++ b/docs/Road Trip Planner — Specification.docx
@@ -42,7 +42,7 @@
           <w:color w:val="64748B"/>
           <w:sz w:val="22"/>
         </w:rPr>
-        <w:t>Version 1.6  ·  Single-file HTML Application</w:t>
+        <w:t>Version 1.7  ·  Single-file HTML Application</w:t>
       </w:r>
     </w:p>
     <w:p>
@@ -9135,7 +9135,21 @@
           <w:i w:val="0"/>
           <w:sz w:val="22"/>
         </w:rPr>
-        <w:t>Each trip with at least one event is serialised to a CSV file and uploaded to /data/{trip-name}.csv in the repo.</w:t>
+        <w:t>Saving first shows a checklist of every local trip that has events (all pre-checked, with a select/deselect-all toggle) — only the checked trips are written to GitHub, so a single-trip update never has to touch the others.</w:t>
+      </w:r>
+    </w:p>
+    <w:p>
+      <w:pPr>
+        <w:pStyle w:val="ListBullet"/>
+        <w:ind w:left="432"/>
+      </w:pPr>
+      <w:r>
+        <w:rPr>
+          <w:rFonts w:ascii="Arial" w:hAnsi="Arial"/>
+          <w:i w:val="0"/>
+          <w:sz w:val="22"/>
+        </w:rPr>
+        <w:t>Each selected trip is serialised to a CSV file and uploaded to /data/{trip-name}.csv in the repo.</w:t>
       </w:r>
     </w:p>
     <w:p>
@@ -9218,7 +9232,7 @@
           <w:i w:val="0"/>
           <w:sz w:val="22"/>
         </w:rPr>
-        <w:t>Lists all .csv files in /data/ and imports each one as a trip (same format as local CSV import).</w:t>
+        <w:t>Loading first lists the .csv trip files in /data/ as a checklist, each badged “will replace local” (a local trip with the matching filename exists) or “new.” Only checked trips are imported (same format as local CSV import).</w:t>
       </w:r>
     </w:p>
     <w:p>
@@ -9232,7 +9246,7 @@
           <w:i w:val="0"/>
           <w:sz w:val="22"/>
         </w:rPr>
-        <w:t>If trips already exist in localStorage, a warning panel is shown before proceeding. The user must confirm by completing a slide-to-confirm gesture (drag the thumb to the right end of the track).</w:t>
+        <w:t>The slide-to-confirm gesture (drag the thumb to the right end of the track) gates the load only when at least one checked trip would replace a local one — its warning states exactly how many. Loading only new trips proceeds without the gate.</w:t>
       </w:r>
     </w:p>
     <w:p>
@@ -10299,23 +10313,6 @@
       </w:r>
     </w:p>
     <w:p>
-      <w:r>
-        <w:rPr>
-          <w:rFonts w:ascii="Arial" w:hAnsi="Arial"/>
-          <w:sz w:val="22"/>
-        </w:rPr>
-        <w:t>Manually attaching photos one event at a time (Section 21.2) doesn't scale once a trip has accumulated dozens or hundreds of camera-roll photos with no obvious link back to which event they belong to. The Import Photos flow, opened from the 📷 icon in each trip's action row (Section 5.2), lets the user pick a large batch of photos at once; each one is scored against every event by comparing its EXIF capture date and GPS location against that event's time window and location, and the closest match is pre-selected as a suggestion — but every single photo still waits for the user to explicitly confirm it before it's attached to anything, so nothing is ever added to an event automatically. Batches are capped at 50 photos at a time — larger batches can appear to stall while iOS downloads full-resolution originals from iCloud one at a time — and each photo has its own processing ceiling so a single slow download can't block the rest of the batch.</w:t>
-      </w:r>
-    </w:p>
-    <w:p>
-      <w:pPr>
-        <w:pStyle w:val="Heading2"/>
-      </w:pPr>
-      <w:r>
-        <w:t>23.2  Reading Photo Metadata</w:t>
-      </w:r>
-    </w:p>
-    <w:p>
       <w:pPr>
         <w:pStyle w:val="ListBullet"/>
         <w:ind w:left="432"/>
@@ -10326,7 +10323,7 @@
           <w:i w:val="0"/>
           <w:sz w:val="22"/>
         </w:rPr>
-        <w:t>Each selected file's EXIF data (capture date/time and GPS coordinates, if present) is read client-side via the exifr library before the photo is resized (resizing strips EXIF). If a photo has no EXIF date at all, the file's own last-modified time is used instead as a much less reliable fallback, and is labeled as such during manual review.</w:t>
+        <w:t>Manually attaching photos one event at a time (Section 21.2) doesn't scale once a trip has accumulated dozens of camera-roll photos. The Import Photos flow, opened from the 📷 icon in each trip's action row (Section 5.2), lets the user pick a batch of up to 50 photos at once; each is scored against every event in the trip (Section 23.3) and the closest match pre-selected as a suggestion — but every photo waits for explicit user confirmation before it's attached to anything. Nothing is ever added automatically.</w:t>
       </w:r>
     </w:p>
     <w:p>
@@ -10340,15 +10337,7 @@
           <w:i w:val="0"/>
           <w:sz w:val="22"/>
         </w:rPr>
-        <w:t>Event coordinates are derived the same way the route maps are (Section 20): sleeping/dining/sightseeing events geocode their own address field; driving legs use the midpoint of the geocoded departure and arrival addresses. The geocode cache (Section 20.3) is reused and pre-warmed for every event in the trip before the first photo is scored, so only the very first import in a session pays the geocoding cost.</w:t>
-      </w:r>
-    </w:p>
-    <w:p>
-      <w:pPr>
-        <w:pStyle w:val="Heading2"/>
-      </w:pPr>
-      <w:r>
-        <w:t>23.3  Confidence Scoring</w:t>
+        <w:t>The photo pickers explicitly accept HEIC/HEIF files. This matters: with a generic image-only picker, iOS Safari transcodes HEIC camera photos (the iPhone default format) to JPEG during selection and strips their EXIF date and GPS in the process, which destroyed matching quality. Accepting HEIC makes Safari hand over untouched originals; Safari decodes HEIC natively for the resize step and the stored output is still JPEG.</w:t>
       </w:r>
     </w:p>
     <w:p>
@@ -10362,7 +10351,15 @@
           <w:i w:val="0"/>
           <w:sz w:val="22"/>
         </w:rPr>
-        <w:t>Each photo is scored against every event in the trip on four factors, combined into a single 0-1 score: a time score (1.0 inside the event's start/end window padded by a category-specific number of hours — 3h for sightseeing/sleeping, 2h for driving/dining/transportation, 1h for working/blocked — fading to 0 over 3 additional hours beyond that); a location score (1.0 within 0.5 miles of the event's coordinate, fading to 0 by 10 miles, or a neutral 0.6 if either the photo or the event has no GPS data); a category weight (sightseeing and sleeping are weighted highest, since they're the most likely to have photos actually taken during them, driving legs lowest); and a reliability multiplier (Section 23.8) that discounts photos whose metadata looks untrustworthy — e.g. a re-shared WhatsApp/Messages copy with no GPS and a suspiciously small file size.</w:t>
+        <w:t>Per-photo guards protect the batch: files over 80MB, or images over 80 megapixels (collage-app exports are small on disk but enormous in pixels — decoding needs ~4 bytes per pixel of RAM and can memory-kill a phone tab), fail fast with a clear reason instead of hanging the batch. Each processing step also carries its own timeout so one stuck photo (e.g. a slow iCloud download) can't freeze the rest.</w:t>
+      </w:r>
+    </w:p>
+    <w:p>
+      <w:pPr>
+        <w:pStyle w:val="Heading2"/>
+      </w:pPr>
+      <w:r>
+        <w:t>23.2  Reading Photo Metadata</w:t>
       </w:r>
     </w:p>
     <w:p>
@@ -10376,15 +10373,7 @@
           <w:i w:val="0"/>
           <w:sz w:val="22"/>
         </w:rPr>
-        <w:t>A photo whose top-scoring event reaches at least 0.6 and leads the second-best event by at least 0.15 is labeled a "confident" suggestion, shown at the top of the review list with that event pre-selected in its dropdown; a top score below 0.25 is labeled "unmatched" (no candidate is close enough to suggest at all); anything in between is labeled "ambiguous." Either way, the score only ever produces a suggestion — the photo is not attached to any event until the user taps Assign (Section 23.6).</w:t>
-      </w:r>
-    </w:p>
-    <w:p>
-      <w:pPr>
-        <w:pStyle w:val="Heading2"/>
-      </w:pPr>
-      <w:r>
-        <w:t>23.4  Staging Folder &amp; Resumability</w:t>
+        <w:t>EXIF (capture date/time and GPS) is read client-side via the exifr library before resizing (resizing strips EXIF). The library itself is fetched resiliently: page-load failures (dropped CDN request on a flaky connection) are recovered by re-attempting the load, with retries, when an import starts — and if it still can't be fetched, the user is asked whether to proceed with degraded matching rather than silently mislabeling every photo as having no EXIF.</w:t>
       </w:r>
     </w:p>
     <w:p>
@@ -10398,7 +10387,7 @@
           <w:i w:val="0"/>
           <w:sz w:val="22"/>
         </w:rPr>
-        <w:t>Every selected photo is resized and uploaded (Section 21.3) to a temporary media/_import_staging/{trip-name}/ folder in the repo first — never directly to an event. Only once the user confirms a match (Section 23.6) is the photo moved into its event's photo list: the same bytes are written to the final media/{filename}.jpg path and the staged copy is deleted (ghCommitStagedPhoto()), so a committed photo ends up in exactly the same place a manually-attached one would.</w:t>
+        <w:t>The default lite exifr build only parses JPEG/HEIC. If it finds no date, the full build is loaded once per session and the photo re-parsed — PNG files (the most common collage-app export) keep their metadata in structures only the full build reads. The review card distinguishes “no EXIF present” from “metadata couldn't be read,” and every card shows the photo's date source, GPS presence, and file size.</w:t>
       </w:r>
     </w:p>
     <w:p>
@@ -10412,7 +10401,15 @@
           <w:i w:val="0"/>
           <w:sz w:val="22"/>
         </w:rPr>
-        <w:t>A photo that's discarded during review, or whose event is never decided, is deleted from the staging folder outright (ghDiscardStagedPhoto()) rather than left orphaned.</w:t>
+        <w:t>Event coordinates reuse the maps' geocode cache (Section 20.3), pre-warmed for the whole trip before the first photo is scored; driving legs additionally pre-warm their OSRM route polylines. All of these lookups carry timeouts — an unbounded geocode request once froze entire batches before photo #1.</w:t>
+      </w:r>
+    </w:p>
+    <w:p>
+      <w:pPr>
+        <w:pStyle w:val="Heading2"/>
+      </w:pPr>
+      <w:r>
+        <w:t>23.3  Confidence Scoring</w:t>
       </w:r>
     </w:p>
     <w:p>
@@ -10426,7 +10423,7 @@
           <w:i w:val="0"/>
           <w:sz w:val="22"/>
         </w:rPr>
-        <w:t>The list of not-yet-committed photos (their EXIF metadata, staging URL, and candidate matches) is kept in a per-trip queue in localStorage, and mirrored as a small JSON file on GitHub whenever it changes. This means the review can be closed and picked back up later — even from a different device or browser — and the queue being empty is exactly the signal that nothing is left to review. Deleting a trip discards its entire queue and every staged photo in it.</w:t>
+        <w:t>Each photo is scored 0–1 against every event as (timeScore × wT + locationScore × wL) × categoryWeight × reliability. The time/location weights ADAPT to the signals the photo actually carries: GPS + EXIF date → 45/55 (location is near-conclusive); GPS only → 25/75; EXIF date but no GPS → 85/15 (a solid timestamp isn't diluted by a permanently-neutral location); neither → 60/40.</w:t>
       </w:r>
     </w:p>
     <w:p>
@@ -10440,7 +10437,7 @@
           <w:i w:val="0"/>
           <w:sz w:val="22"/>
         </w:rPr>
-        <w:t>Every GitHub write in this pipeline (staging upload, committing to media/, deleting a staged or replaced file) re-fetches the target path's current sha immediately before writing, and automatically retries once if GitHub reports a sha conflict rather than surfacing a raw API error. Committing a photo is also idempotent: if the final file already exists with identical content, the write is skipped instead of re-uploaded — this makes it safe to retry a commit after a partial failure without duplicating or corrupting anything.</w:t>
+        <w:t>Time score: 1.0 strictly inside the event's window, 0.85 within the category-specific padding (3h sightseeing/sleeping, 2h driving/dining/transportation, 1h working/blocked), fading to 0 over 3 further hours. Strictly-inside beating padded is what disambiguates adjacent events (e.g. dinner right after sightseeing). A file-only date (no EXIF) is blended 35% toward neutral — file dates usually record when iOS saved the file, not when the photo was taken, and a wrong date must not be able to veto every event (which previously made whole batches come out “no match at all”).</w:t>
       </w:r>
     </w:p>
     <w:p>
@@ -10454,15 +10451,7 @@
           <w:i w:val="0"/>
           <w:sz w:val="22"/>
         </w:rPr>
-        <w:t>A photo committed on one device can take a short while to propagate through GitHub's raw-content CDN before it's visible on another device resuming the same review. If a review thumbnail fails to load, it's retried automatically with increasing delays (1.5s, 3s, 6s, 10s); if it still hasn't appeared after all four attempts, a friendly note explains that the photo is still syncing and to check back shortly, rather than showing a broken-image icon.</w:t>
-      </w:r>
-    </w:p>
-    <w:p>
-      <w:pPr>
-        <w:pStyle w:val="Heading2"/>
-      </w:pPr>
-      <w:r>
-        <w:t>23.5  Replacing a Photo at the 9-Photo Cap</w:t>
+        <w:t>Location score: 1.0 within 0.5 miles, fading to 0 by 10 miles, neutral 0.6 when either side lacks coordinates. Driving legs are scored against the ACTUAL ROAD: distance to the nearest point on the leg's cached OSRM route polyline (proper point-to-segment projection), not to a straight-line midpoint — a photo at a viewpoint anywhere along a 300-mile winding leg scores as well as one near the endpoints. Falls back to the midpoint approach when no route is available.</w:t>
       </w:r>
     </w:p>
     <w:p>
@@ -10476,15 +10465,7 @@
           <w:i w:val="0"/>
           <w:sz w:val="22"/>
         </w:rPr>
-        <w:t>If the event selected when a photo is assigned already has 9 photos (Section 21.1), Assign opens a replacement picker showing all 9 existing photos on that event instead of a blind "add anyway?" confirmation. The user taps the one they want to swap out; the new photo takes its place on the event and the replaced photo is deleted from GitHub. Cancelling the picker leaves both the event and the pending photo untouched.</w:t>
-      </w:r>
-    </w:p>
-    <w:p>
-      <w:pPr>
-        <w:pStyle w:val="Heading2"/>
-      </w:pPr>
-      <w:r>
-        <w:t>23.6  Manual Review</w:t>
+        <w:t>Out-and-back disambiguation: for a photo with GPS + EXIF taken mid-leg, its position is compared to where the driver SHOULD be at that fraction of the leg's time window (measured along the route). Large inconsistency penalizes the location score up to 40%, so the outbound leg outranks the return leg sharing the same road. Tolerance is generous (≥ 25% of route length) so stops and detours don't false-flag.</w:t>
       </w:r>
     </w:p>
     <w:p>
@@ -10498,7 +10479,7 @@
           <w:i w:val="0"/>
           <w:sz w:val="22"/>
         </w:rPr>
-        <w:t>Every imported photo appears in a review list inside the Import Photos panel — none are attached automatically. The list is split into two top-level sections: photos with a real EXIF capture date first, and photos without one (file-date fallback or no date at all) in a separate "Photos without date info" section at the bottom, since those matches are inherently less trustworthy. A "Discard all" button sits at the top of that second section for clearing it in one action, with a confirmation prompt since it can't be undone.</w:t>
+        <w:t>Classification: top score ≥ 0.6 with a ≥ 0.15 lead → “confident” (pre-selected, one-tap Assign); top score &lt; 0.25 → “unmatched”; anything between → “ambiguous.” Scores are shown as percentages in the review UI and next to each candidate event in the dropdown.</w:t>
       </w:r>
     </w:p>
     <w:p>
@@ -10512,7 +10493,15 @@
           <w:i w:val="0"/>
           <w:sz w:val="22"/>
         </w:rPr>
-        <w:t>Within each of those two sections, entries are further grouped into "Suggested matches" (confident scores, Section 23.3, with the top event already pre-selected — a one-tap confirm), "Needs a closer look" (ambiguous matches, no match at all, or an upload error), and "Likely duplicates" (Section 23.7). Each entry shows its thumbnail (click to view full-screen), capture date (flagged if it's a file-date fallback), GPS presence and file size, and a dropdown of candidate events with the top-scoring suggestions grouped above the full event list.</w:t>
+        <w:t>Neighbor voting: after a batch is scored, photos are clustered by EXIF-timestamp gaps (≤ 15 minutes). When a cluster's confident members all agree on one event, weaker members are promoted one rung (ambiguous → confident, unmatched → ambiguous) — but only if that event was already among their own top candidates: neighbors reinforce an existing hypothesis, they never invent one. Promoted cards carry a “photos taken minutes apart match that event” note.</w:t>
+      </w:r>
+    </w:p>
+    <w:p>
+      <w:pPr>
+        <w:pStyle w:val="Heading2"/>
+      </w:pPr>
+      <w:r>
+        <w:t>23.4  Staging Folder &amp; Resumability</w:t>
       </w:r>
     </w:p>
     <w:p>
@@ -10526,15 +10515,7 @@
           <w:i w:val="0"/>
           <w:sz w:val="22"/>
         </w:rPr>
-        <w:t>"Assign" commits the photo to whichever event is selected in the dropdown (opening the replacement picker, Section 23.5, if that event is already at the 9-photo limit); "Discard" deletes the staged photo entirely. There is no "create a new event from this photo" option — every photo is assigned to an existing event or discarded.</w:t>
-      </w:r>
-    </w:p>
-    <w:p>
-      <w:pPr>
-        <w:pStyle w:val="Heading2"/>
-      </w:pPr>
-      <w:r>
-        <w:t>23.7  Duplicate Detection</w:t>
+        <w:t>Every selected photo is resized and uploaded to a temporary media/_import_staging/{trip-name}/ folder first — never directly to an event. Only on user confirmation is it moved to the final media/ path and the staged copy deleted; a committed photo ends up exactly where a manually-attached one would. Discarding deletes the staged copy outright.</w:t>
       </w:r>
     </w:p>
     <w:p>
@@ -10548,7 +10529,7 @@
           <w:i w:val="0"/>
           <w:sz w:val="22"/>
         </w:rPr>
-        <w:t>Before uploading anything, each selected file's content is hashed (SHA-256, computed from the original file bytes before resizing) and checked against every photo already attached to the trip (recorded at commit time, whether via bulk import or the single-event form) and against every other photo already selected earlier in the same batch. A match means the exact same original file has already been imported.</w:t>
+        <w:t>A placeholder for EVERY selected file is registered and persisted before any processing starts, so an interrupted batch (tab closed, page evicted) can never silently lose the files it hadn't reached — on next load they surface as recoverable “interrupted” review items (Section 23.9). The queue lives in localStorage and is mirrored (debounced, previews stripped) as a small JSON manifest on GitHub, so a review can be resumed from another device; deleting a trip discards its queue, staged files, and manifest.</w:t>
       </w:r>
     </w:p>
     <w:p>
@@ -10562,15 +10543,7 @@
           <w:i w:val="0"/>
           <w:sz w:val="22"/>
         </w:rPr>
-        <w:t>A detected duplicate is not skipped silently — it appears in the review list under "Likely duplicates — discard suggested," using only a lightweight local preview rather than uploading it to staging. Discard is the emphasized action for these entries. Assigning a duplicate of an already-committed photo reuses that photo's existing URL instead of re-uploading it; a duplicate of another photo still pending earlier in the same batch can only be discarded, since there's nothing to attach until the earlier copy itself is resolved.</w:t>
-      </w:r>
-    </w:p>
-    <w:p>
-      <w:pPr>
-        <w:pStyle w:val="Heading2"/>
-      </w:pPr>
-      <w:r>
-        <w:t>23.8  Reliability Scoring &amp; Quality Warnings</w:t>
+        <w:t>GitHub write discipline: the Contents API creates a branch commit per write, and two concurrent writes race for the branch head — so ALL writes app-wide are funneled through a single queue (one commit at a time). Every write also goes through sha-safe, idempotent wrappers that re-check the target before writing and self-heal conflicts and lost-response retries; network calls carry timeouts and retry transient failures with backoff (built for lossy connections like partially-obstructed Starlink).</w:t>
       </w:r>
     </w:p>
     <w:p>
@@ -10584,7 +10557,15 @@
           <w:i w:val="0"/>
           <w:sz w:val="22"/>
         </w:rPr>
-        <w:t>Photos re-shared through WhatsApp, Messages, or similar apps often keep an altered timestamp and lose their GPS data entirely, which was producing confident-looking but wrong event matches. Each photo gets a reliability multiplier applied to its score (Section 23.3): 1.0 if it has GPS data, 0.8 if it lacks GPS but is a normal camera-photo file size, and 0.45 if it lacks GPS and is under 400KB — the combination most typical of a re-compressed, re-shared copy.</w:t>
+        <w:t>A “Clean up leftover staged photos” link at the bottom of the panel lists the trip's staging folder on GitHub, compares it against the current queue, and (after confirmation) deletes any orphans — the safety net for uploads whose record was lost mid-interruption.</w:t>
+      </w:r>
+    </w:p>
+    <w:p>
+      <w:pPr>
+        <w:pStyle w:val="Heading2"/>
+      </w:pPr>
+      <w:r>
+        <w:t>23.5  Replacing a Photo at the 9-Photo Cap</w:t>
       </w:r>
     </w:p>
     <w:p>
@@ -10598,15 +10579,7 @@
           <w:i w:val="0"/>
           <w:sz w:val="22"/>
         </w:rPr>
-        <w:t>Whenever a photo's reliability is discounted for lacking GPS and being unusually small, its review entry (Section 23.6) shows an amber warning banner explaining exactly why — e.g. "no GPS data and only 180KB, much smaller than a native camera photo" — so the user can judge the match for themselves rather than trusting a silent score.</w:t>
-      </w:r>
-    </w:p>
-    <w:p>
-      <w:pPr>
-        <w:pStyle w:val="Heading2"/>
-      </w:pPr>
-      <w:r>
-        <w:t>23.9  Resilience &amp; Error Recovery</w:t>
+        <w:t>If the chosen event already has 9 photos (Section 21.1), Assign opens a replacement picker showing all 9 existing photos; tapping one swaps it for the new photo (the replaced file is deleted from GitHub). Cancelling leaves everything untouched.</w:t>
       </w:r>
     </w:p>
     <w:p>
@@ -10620,7 +10593,15 @@
           <w:i w:val="0"/>
           <w:sz w:val="22"/>
         </w:rPr>
-        <w:t>Assigning or replacing a photo has its own 30-second ceiling; if the GitHub save call hangs, the entry falls back to an error state instead of staying stuck forever. While a save is in progress the entry shows in a visible "Saving…" row (rather than disappearing from the list), with a "Taking too long? Reset" button that returns it to a reviewable state if something does go wrong — closing a bug where a hung save could leave the entire review panel unresponsive to both Assign and Discard on every other photo.</w:t>
+        <w:t>A thumbnail that fails to load is retried with backoff (CDN lag), then shown as a visible, still-tappable “not loading — tap to replace” placeholder rather than hidden: the count must always show all 9, and a dead photo is precisely the one most worth replacing.</w:t>
+      </w:r>
+    </w:p>
+    <w:p>
+      <w:pPr>
+        <w:pStyle w:val="Heading2"/>
+      </w:pPr>
+      <w:r>
+        <w:t>23.6  Manual Review</w:t>
       </w:r>
     </w:p>
     <w:p>
@@ -10634,7 +10615,143 @@
           <w:i w:val="0"/>
           <w:sz w:val="22"/>
         </w:rPr>
-        <w:t>Each review entry renders defensively: if a single photo's data is ever malformed in a way that would otherwise throw an error and abort the whole list, that entry falls back to a plain "Couldn't display this photo" card with just a Discard button, so one bad entry can never take down the rest of the review.</w:t>
+        <w:t>Every photo lands in a review list — none attach automatically. Top-level split: photos with a real EXIF date first, then a “Photos without date info” section (file-date fallback or none) whose matches are inherently less trustworthy, with a confirm-gated “Discard all” button for clearing that whole section at once. Within each: “Suggested matches” (confident, pre-selected), “Needs a closer look” (ambiguous/unmatched/errors), and “Likely duplicates” (Section 23.7).</w:t>
+      </w:r>
+    </w:p>
+    <w:p>
+      <w:pPr>
+        <w:pStyle w:val="ListBullet"/>
+        <w:ind w:left="432"/>
+      </w:pPr>
+      <w:r>
+        <w:rPr>
+          <w:rFonts w:ascii="Arial" w:hAnsi="Arial"/>
+          <w:i w:val="0"/>
+          <w:sz w:val="22"/>
+        </w:rPr>
+        <w:t>Each card shows the photo full-width in its real aspect ratio (tap for full-screen), its date (flagged when file-date fallback or unreadable metadata), GPS presence, file size, per-candidate percentage scores, and warning/info notes (quality suspicion, neighbor voting). “Assign” commits to the selected event (or opens the replacement picker at the cap); “Discard” deletes the staged photo.</w:t>
+      </w:r>
+    </w:p>
+    <w:p>
+      <w:pPr>
+        <w:pStyle w:val="ListBullet"/>
+        <w:ind w:left="432"/>
+      </w:pPr>
+      <w:r>
+        <w:rPr>
+          <w:rFonts w:ascii="Arial" w:hAnsi="Arial"/>
+          <w:i w:val="0"/>
+          <w:sz w:val="22"/>
+        </w:rPr>
+        <w:t>Failed photos show a Retry button (same session only — the browser still holds the original file in memory; after a reload the file is gone and only Discard remains). Two or more failures also surface bulk “Retry all failed” / “Discard all failed” actions. A running batch shows one progress row with the active photo's thumbnail plus a “N more photos waiting” counter, a “Photo X of Y” chip, and a “Cancel remaining photos” button that stops the batch between photos.</w:t>
+      </w:r>
+    </w:p>
+    <w:p>
+      <w:pPr>
+        <w:pStyle w:val="ListBullet"/>
+        <w:ind w:left="432"/>
+      </w:pPr>
+      <w:r>
+        <w:rPr>
+          <w:rFonts w:ascii="Arial" w:hAnsi="Arial"/>
+          <w:i w:val="0"/>
+          <w:sz w:val="22"/>
+        </w:rPr>
+        <w:t>The panel is stable while photos upload: re-renders anchor the scroll position to the card being viewed and preserve any dropdown choice mid-selection, so reviewing can start while the rest of the batch is still processing. Opening the panel also checks browser-storage headroom and warns above 85% usage.</w:t>
+      </w:r>
+    </w:p>
+    <w:p>
+      <w:pPr>
+        <w:pStyle w:val="Heading2"/>
+      </w:pPr>
+      <w:r>
+        <w:t>23.7  Duplicate Detection</w:t>
+      </w:r>
+    </w:p>
+    <w:p>
+      <w:pPr>
+        <w:pStyle w:val="ListBullet"/>
+        <w:ind w:left="432"/>
+      </w:pPr>
+      <w:r>
+        <w:rPr>
+          <w:rFonts w:ascii="Arial" w:hAnsi="Arial"/>
+          <w:i w:val="0"/>
+          <w:sz w:val="22"/>
+        </w:rPr>
+        <w:t>Each file's SHA-256 (of the original bytes, before resizing) is checked against every photo already attached to the trip and everything selected earlier in the same batch. Detected duplicates are surfaced under “Likely duplicates — discard suggested” with a local-only preview (never uploaded), Discard emphasized. Assigning a duplicate of an already-committed photo reuses the existing URL; an in-batch duplicate of a still-pending photo can only be discarded. Photos whose bytes can't be hashed skip duplicate detection entirely rather than false-matching other unhashed entries.</w:t>
+      </w:r>
+    </w:p>
+    <w:p>
+      <w:pPr>
+        <w:pStyle w:val="Heading2"/>
+      </w:pPr>
+      <w:r>
+        <w:t>23.8  Reliability Scoring &amp; Quality Warnings</w:t>
+      </w:r>
+    </w:p>
+    <w:p>
+      <w:pPr>
+        <w:pStyle w:val="ListBullet"/>
+        <w:ind w:left="432"/>
+      </w:pPr>
+      <w:r>
+        <w:rPr>
+          <w:rFonts w:ascii="Arial" w:hAnsi="Arial"/>
+          <w:i w:val="0"/>
+          <w:sz w:val="22"/>
+        </w:rPr>
+        <w:t>Re-shared photos (WhatsApp/Messages) lose GPS and often carry altered timestamps. Each photo's score is multiplied by a reliability factor: 1.0 with GPS, 0.8 without GPS at normal camera-photo size, 0.45 without GPS and under 400KB (the re-compressed re-share signature). When discounted for the latter, the review card shows an amber banner stating the exact reasons (no GPS, size) so the user can judge for themselves.</w:t>
+      </w:r>
+    </w:p>
+    <w:p>
+      <w:pPr>
+        <w:pStyle w:val="Heading2"/>
+      </w:pPr>
+      <w:r>
+        <w:t>23.9  Resilience &amp; Error Recovery</w:t>
+      </w:r>
+    </w:p>
+    <w:p>
+      <w:pPr>
+        <w:pStyle w:val="ListBullet"/>
+        <w:ind w:left="432"/>
+      </w:pPr>
+      <w:r>
+        <w:rPr>
+          <w:rFonts w:ascii="Arial" w:hAnsi="Arial"/>
+          <w:i w:val="0"/>
+          <w:sz w:val="22"/>
+        </w:rPr>
+        <w:t>Entries still marked mid-upload/mid-save at app load are swept into recoverable “interrupted” error cards (the loop that owned them is gone and the files were never persisted — nothing can resume them silently). Photo previews are never serialized to localStorage or the GitHub manifest: embedded previews once blew past the ~5MB storage quota and killed every new batch at its first save; storage bloated by older versions is repaired automatically at load.</w:t>
+      </w:r>
+    </w:p>
+    <w:p>
+      <w:pPr>
+        <w:pStyle w:val="ListBullet"/>
+        <w:ind w:left="432"/>
+      </w:pPr>
+      <w:r>
+        <w:rPr>
+          <w:rFonts w:ascii="Arial" w:hAnsi="Arial"/>
+          <w:i w:val="0"/>
+          <w:sz w:val="22"/>
+        </w:rPr>
+        <w:t>Assign/replace saves show a visible “Saving…” row with a manual Reset escape hatch and a generous 120s ceiling. Because a timeout abandons the wait but not the operation, a finalizer rides on the commit itself: if it lands late (“zombie commit”), state is still saved, persisted, and re-rendered correctly. Raw GitHub sha/conflict errors are translated to plain language before reaching the user.</w:t>
+      </w:r>
+    </w:p>
+    <w:p>
+      <w:pPr>
+        <w:pStyle w:val="ListBullet"/>
+        <w:ind w:left="432"/>
+      </w:pPr>
+      <w:r>
+        <w:rPr>
+          <w:rFonts w:ascii="Arial" w:hAnsi="Arial"/>
+          <w:i w:val="0"/>
+          <w:sz w:val="22"/>
+        </w:rPr>
+        <w:t>Each review card renders defensively — a malformed entry falls back to a “Couldn't display this photo” card with a Discard button instead of taking down the whole panel. Photos not yet visible on another device retry with backoff and then explain CDN sync lag instead of showing a broken image.</w:t>
       </w:r>
     </w:p>
     <w:p>

</xml_diff>

<commit_message>
Update spec doc 2026-07-22 17:44
</commit_message>
<xml_diff>
--- a/docs/Road Trip Planner — Specification.docx
+++ b/docs/Road Trip Planner — Specification.docx
@@ -42,7 +42,7 @@
           <w:color w:val="64748B"/>
           <w:sz w:val="22"/>
         </w:rPr>
-        <w:t>Version 1.7  ·  Single-file HTML Application</w:t>
+        <w:t>Version 1.8  ·  Single-file HTML Application</w:t>
       </w:r>
     </w:p>
     <w:p>
@@ -2469,6 +2469,56 @@
     </w:p>
     <w:p>
       <w:pPr>
+        <w:pStyle w:val="Heading2"/>
+      </w:pPr>
+      <w:r>
+        <w:t>2.7  Automated Tests &amp; Publish Gate</w:t>
+      </w:r>
+    </w:p>
+    <w:p>
+      <w:pPr>
+        <w:pStyle w:val="ListBullet"/>
+        <w:ind w:left="432"/>
+      </w:pPr>
+      <w:r>
+        <w:rPr>
+          <w:rFonts w:ascii="Arial" w:hAnsi="Arial"/>
+          <w:i w:val="0"/>
+          <w:sz w:val="22"/>
+        </w:rPr>
+        <w:t>A Node-based test suite (tests/run-tests.js, alongside the app) runs entirely offline against index.html: structural checks (the embedded script compiles; div/button/label/select/span tags are balanced) plus 50+ unit tests over the logic most prone to regression — photo-import scoring and classification, neighbor voting, route-geometry math, duplicate/hash edge cases, GitHub error handling (sha-conflict variants), CSV escaping round-trips, pending-import housekeeping, and the new-event default-start rules.</w:t>
+      </w:r>
+    </w:p>
+    <w:p>
+      <w:pPr>
+        <w:pStyle w:val="ListBullet"/>
+        <w:ind w:left="432"/>
+      </w:pPr>
+      <w:r>
+        <w:rPr>
+          <w:rFonts w:ascii="Arial" w:hAnsi="Arial"/>
+          <w:i w:val="0"/>
+          <w:sz w:val="22"/>
+        </w:rPr>
+        <w:t>The suite evaluates the app's real script in a sandbox with stubbed browser APIs; network calls reject, exercising the app's own offline fallbacks exactly as designed.</w:t>
+      </w:r>
+    </w:p>
+    <w:p>
+      <w:pPr>
+        <w:pStyle w:val="ListBullet"/>
+        <w:ind w:left="432"/>
+      </w:pPr>
+      <w:r>
+        <w:rPr>
+          <w:rFonts w:ascii="Arial" w:hAnsi="Arial"/>
+          <w:i w:val="0"/>
+          <w:sz w:val="22"/>
+        </w:rPr>
+        <w:t>The publish script runs the suite first and ABORTS the deploy on any failure (when Node.js is available), so a change that breaks tested behavior cannot reach the live site.</w:t>
+      </w:r>
+    </w:p>
+    <w:p>
+      <w:pPr>
         <w:pStyle w:val="Heading1"/>
       </w:pPr>
       <w:r>
@@ -4622,7 +4672,21 @@
           <w:i w:val="0"/>
           <w:sz w:val="22"/>
         </w:rPr>
-        <w:t>Double-click any day column on the calendar — start date pre-filled to clicked day; if the click was on a trip band, that trip is pre-selected.</w:t>
+        <w:t>Double-click any day column on the calendar — the form opens with a suggested start time; if the click was on a trip band, that trip is pre-selected.</w:t>
+      </w:r>
+    </w:p>
+    <w:p>
+      <w:pPr>
+        <w:pStyle w:val="ListBullet"/>
+        <w:ind w:left="432"/>
+      </w:pPr>
+      <w:r>
+        <w:rPr>
+          <w:rFonts w:ascii="Arial" w:hAnsi="Arial"/>
+          <w:i w:val="0"/>
+          <w:sz w:val="22"/>
+        </w:rPr>
+        <w:t>The suggested start is derived from the exact CLICK POSITION mapped to a time of day: the new event starts right after the latest-ending event that had already started at the clicked moment (snapped to 15 minutes). Events later that day are ignored — an evening overnight stay must not affect an afternoon click (previously it dragged every suggestion to the next morning, e.g. “tomorrow at 5am”). Clicking inside a running event suggests the slot right after it ends; a day with no prior events defaults to 9:00 AM.</w:t>
       </w:r>
     </w:p>
     <w:p>

</xml_diff>

<commit_message>
Update spec doc 2026-07-23 19:56
</commit_message>
<xml_diff>
--- a/docs/Road Trip Planner — Specification.docx
+++ b/docs/Road Trip Planner — Specification.docx
@@ -42,7 +42,7 @@
           <w:color w:val="64748B"/>
           <w:sz w:val="22"/>
         </w:rPr>
-        <w:t>Version 1.8  ·  Single-file HTML Application</w:t>
+        <w:t>Version 1.9  ·  Single-file HTML Application</w:t>
       </w:r>
     </w:p>
     <w:p>
@@ -4686,7 +4686,35 @@
           <w:i w:val="0"/>
           <w:sz w:val="22"/>
         </w:rPr>
-        <w:t>The suggested start is derived from the exact CLICK POSITION mapped to a time of day: the new event starts right after the latest-ending event that had already started at the clicked moment (snapped to 15 minutes). Events later that day are ignored — an evening overnight stay must not affect an afternoon click (previously it dragged every suggestion to the next morning, e.g. “tomorrow at 5am”). Clicking inside a running event suggests the slot right after it ends; a day with no prior events defaults to 9:00 AM.</w:t>
+        <w:t>The suggested start is derived from the exact CLICK POSITION mapped to a time of day: the new event starts right after the latest-ending event — within the target trip only — that had already started at the clicked moment (snapped to 15 minutes). Events later that day are ignored — an evening overnight stay must not affect an afternoon click (previously it dragged every suggestion to the next morning, e.g. “tomorrow at 5am”). Clicking inside a running event suggests the slot right after it ends; a day with no prior events defaults to 9:00 AM. Scoping to one trip matters: two trips running around the same dates must never influence each other's suggestions.</w:t>
+      </w:r>
+    </w:p>
+    <w:p>
+      <w:pPr>
+        <w:pStyle w:val="ListBullet"/>
+        <w:ind w:left="432"/>
+      </w:pPr>
+      <w:r>
+        <w:rPr>
+          <w:rFonts w:ascii="Arial" w:hAnsi="Arial"/>
+          <w:i w:val="0"/>
+          <w:sz w:val="22"/>
+        </w:rPr>
+        <w:t>The target trip resolves through one chain, shared by the double-click and the header button: the trip band directly under the click; else the vertically NEAREST band in the same day column (a click just above/below a band clearly means that trip); else the only trip currently toggled visible (it outranks “last used,” which may point at a hidden trip); else the last-used trip; else Unassigned.</w:t>
+      </w:r>
+    </w:p>
+    <w:p>
+      <w:pPr>
+        <w:pStyle w:val="ListBullet"/>
+        <w:ind w:left="432"/>
+      </w:pPr>
+      <w:r>
+        <w:rPr>
+          <w:rFonts w:ascii="Arial" w:hAnsi="Arial"/>
+          <w:i w:val="0"/>
+          <w:sz w:val="22"/>
+        </w:rPr>
+        <w:t>Debug mode: a deliberately discreet 🐞 toggle inside the New Event form's own header row (hidden when editing; state persisted in localStorage). The reasoning is captured whenever a New Event form opens, so the toggle works retroactively: if a suggested trip/time looks weird, tapping 🐞 right then reveals a plain-language box explaining THAT form's defaults — the clicked time, which rule chose the trip, how many of that trip's events were considered, the anchor event whose end became the suggested start, and how many later-that-day events were ignored.</w:t>
       </w:r>
     </w:p>
     <w:p>
@@ -7204,6 +7232,34 @@
           <w:sz w:val="22"/>
         </w:rPr>
         <w:t>Stats bar: Duration, Events count, Total driving distance (always "X mi · Y km"), Time on the road (whole hours). Stats that are zero/absent are omitted.</w:t>
+      </w:r>
+    </w:p>
+    <w:p>
+      <w:pPr>
+        <w:pStyle w:val="ListBullet"/>
+        <w:ind w:left="432"/>
+      </w:pPr>
+      <w:r>
+        <w:rPr>
+          <w:rFonts w:ascii="Arial" w:hAnsi="Arial"/>
+          <w:i w:val="0"/>
+          <w:sz w:val="22"/>
+        </w:rPr>
+        <w:t>Search row (below the stats bar): a live text filter over the itinerary matching event title, description, every address field, category (label or key, e.g. “driving”), and each day's full heading (so “july 6” or “monday” shows that whole day). Non-matching events hide; days with no visible events collapse; a count line reports “N matching events.” The input's native ✕ clears it; Escape clears the text first and only closes the modal once empty. Multi-day events match consistently on every day they span. The full-route Maps button hides while any filter is active, the row is excluded from print output, and opening the modal always resets all filters.</w:t>
+      </w:r>
+    </w:p>
+    <w:p>
+      <w:pPr>
+        <w:pStyle w:val="ListBullet"/>
+        <w:ind w:left="432"/>
+      </w:pPr>
+      <w:r>
+        <w:rPr>
+          <w:rFonts w:ascii="Arial" w:hAnsi="Arial"/>
+          <w:i w:val="0"/>
+          <w:sz w:val="22"/>
+        </w:rPr>
+        <w:t>Photo filter: a button next to the search box cycling All → With photos → Without photos (color-coded when active). It combines with the text search (both must match) — e.g. “sleeping” + Without photos lists the hotels that still need pictures.</w:t>
       </w:r>
     </w:p>
     <w:p>

</xml_diff>

<commit_message>
Update spec doc 2026-07-23 20:09
</commit_message>
<xml_diff>
--- a/docs/Road Trip Planner — Specification.docx
+++ b/docs/Road Trip Planner — Specification.docx
@@ -42,7 +42,7 @@
           <w:color w:val="64748B"/>
           <w:sz w:val="22"/>
         </w:rPr>
-        <w:t>Version 1.9  ·  Single-file HTML Application</w:t>
+        <w:t>Version 2.0  ·  Single-file HTML Application</w:t>
       </w:r>
     </w:p>
     <w:p>
@@ -9255,7 +9255,7 @@
           <w:i w:val="0"/>
           <w:sz w:val="22"/>
         </w:rPr>
-        <w:t>Saving first shows a checklist of every local trip that has events (all pre-checked, with a select/deselect-all toggle) — only the checked trips are written to GitHub, so a single-trip update never has to touch the others.</w:t>
+        <w:t>Saving first shows a checklist of every local trip that has events, each badged with its sync verdict (Section 18.6) — only the checked trips are written. Defaults follow the verdict: trips with unsaved local changes or new trips are pre-checked; in-sync trips aren't (nothing to do); trips whose save would overwrite a NEWER version from another device (remote-ahead or diverged) start unchecked and must be opted into deliberately.</w:t>
       </w:r>
     </w:p>
     <w:p>
@@ -9352,7 +9352,7 @@
           <w:i w:val="0"/>
           <w:sz w:val="22"/>
         </w:rPr>
-        <w:t>Loading first lists the .csv trip files in /data/ as a checklist, each badged “will replace local” (a local trip with the matching filename exists) or “new.” Only checked trips are imported (same format as local CSV import).</w:t>
+        <w:t>Loading first lists the .csv trip files in /data/ as a checklist, each badged with its sync verdict (Section 18.6). Defaults follow the verdict: “newer on GitHub,” new, and never-synced trips are pre-checked; a trip whose load would DISCARD unsaved local edits (local-ahead or diverged) is never pre-checked. Only checked trips are imported (same format as local CSV import).</w:t>
       </w:r>
     </w:p>
     <w:p>
@@ -9366,7 +9366,21 @@
           <w:i w:val="0"/>
           <w:sz w:val="22"/>
         </w:rPr>
-        <w:t>The slide-to-confirm gesture (drag the thumb to the right end of the track) gates the load only when at least one checked trip would replace a local one — its warning states exactly how many. Loading only new trips proceeds without the gate.</w:t>
+        <w:t>The slide-to-confirm gesture (drag the thumb to the right end of the track) gates the load only when at least one checked trip would replace a local one; the warning states how many, and names any trips whose unsaved local edits would be discarded. Loading only new trips proceeds without the gate.</w:t>
+      </w:r>
+    </w:p>
+    <w:p>
+      <w:pPr>
+        <w:pStyle w:val="ListBullet"/>
+        <w:ind w:left="432"/>
+      </w:pPr>
+      <w:r>
+        <w:rPr>
+          <w:rFonts w:ascii="Arial" w:hAnsi="Arial"/>
+          <w:i w:val="0"/>
+          <w:sz w:val="22"/>
+        </w:rPr>
+        <w:t>Safety net: before a load replaces a trip that has local edits GitHub doesn't have (local-ahead, diverged, or never-synced), the LOCAL version is first uploaded to /data/history/ with a “-localbackup” device tag — “I loaded and lost my unsaved events” is always recoverable.</w:t>
       </w:r>
     </w:p>
     <w:p>
@@ -9497,6 +9511,84 @@
       <w:pPr>
         <w:spacing w:before="0" w:after="0"/>
       </w:pPr>
+    </w:p>
+    <w:p>
+      <w:pPr>
+        <w:pStyle w:val="Heading2"/>
+      </w:pPr>
+      <w:r>
+        <w:t>18.6  Multi-Device Sync State &amp; Drift Detection</w:t>
+      </w:r>
+    </w:p>
+    <w:p>
+      <w:pPr>
+        <w:pStyle w:val="ListBullet"/>
+        <w:ind w:left="432"/>
+      </w:pPr>
+      <w:r>
+        <w:rPr>
+          <w:rFonts w:ascii="Arial" w:hAnsi="Arial"/>
+          <w:i w:val="0"/>
+          <w:sz w:val="22"/>
+        </w:rPr>
+        <w:t>Every save/load records a per-trip fingerprint in localStorage (rtp4_sync_state): the GitHub file sha plus an FNV-1a hash of the trip's CSV at that moment. Comparing both sides against the fingerprint classifies each trip: in sync ✓ · unsaved local changes (local-ahead) · newer on GitHub (remote-ahead) · ⚠ changed on both devices (diverged — previously undetectable, and the classic way events were lost between laptop and phone) · new · not synced from this device yet · missing on GitHub. Verdicts are computed from ONE listing call of /data/ (names + shas).</w:t>
+      </w:r>
+    </w:p>
+    <w:p>
+      <w:pPr>
+        <w:pStyle w:val="ListBullet"/>
+        <w:ind w:left="432"/>
+      </w:pPr>
+      <w:r>
+        <w:rPr>
+          <w:rFonts w:ascii="Arial" w:hAnsi="Arial"/>
+          <w:i w:val="0"/>
+          <w:sz w:val="22"/>
+        </w:rPr>
+        <w:t>Drift checks run automatically: at app open, whenever the tab regains visibility (the moment the user switches devices), and every 5 minutes while open — throttled to at most one listing call per 45s, silently skipped when sync isn't configured, offline, or in read-only shared view.</w:t>
+      </w:r>
+    </w:p>
+    <w:p>
+      <w:pPr>
+        <w:pStyle w:val="ListBullet"/>
+        <w:ind w:left="432"/>
+      </w:pPr>
+      <w:r>
+        <w:rPr>
+          <w:rFonts w:ascii="Arial" w:hAnsi="Arial"/>
+          <w:i w:val="0"/>
+          <w:sz w:val="22"/>
+        </w:rPr>
+        <w:t>When something needs attention, a floating dismissible banner appears under the header (e.g. “☁ 'Alaska 2026' has newer data on GitHub · ✏ 'Yukon' has unsaved local changes — Open Sync”). Dismissing remembers that exact situation; the banner only reappears when the state changes. The header's cloud button additionally shows a small count badge while any trip needs attention, persisting quietly after the banner is dismissed.</w:t>
+      </w:r>
+    </w:p>
+    <w:p>
+      <w:pPr>
+        <w:pStyle w:val="ListBullet"/>
+        <w:ind w:left="432"/>
+      </w:pPr>
+      <w:r>
+        <w:rPr>
+          <w:rFonts w:ascii="Arial" w:hAnsi="Arial"/>
+          <w:i w:val="0"/>
+          <w:sz w:val="22"/>
+        </w:rPr>
+        <w:t>Saving with identical content still records a sync point; renaming a trip carries its fingerprint to the new filename (the GitHub file keeps the old name until the next save); deleting a trip removes its fingerprint. Verdicts are only meaningful once a first save/load has been performed from a given device — until then a trip reads “not synced from this device yet.”</w:t>
+      </w:r>
+    </w:p>
+    <w:p>
+      <w:pPr>
+        <w:pStyle w:val="ListBullet"/>
+        <w:ind w:left="432"/>
+      </w:pPr>
+      <w:r>
+        <w:rPr>
+          <w:rFonts w:ascii="Arial" w:hAnsi="Arial"/>
+          <w:i w:val="0"/>
+          <w:sz w:val="22"/>
+        </w:rPr>
+        <w:t>No automatic merging, by design: matching “the same event edited differently on two devices” is guesswork, and a wrong merge silently corrupts a trip. The app's contract is detection + explicit user choice, with the losing side always archived to /data/history/.</w:t>
+      </w:r>
     </w:p>
     <w:p>
       <w:pPr>

</xml_diff>

<commit_message>
Update spec doc 2026-07-27 09:09
</commit_message>
<xml_diff>
--- a/docs/Road Trip Planner — Specification.docx
+++ b/docs/Road Trip Planner — Specification.docx
@@ -42,7 +42,7 @@
           <w:color w:val="64748B"/>
           <w:sz w:val="22"/>
         </w:rPr>
-        <w:t>Version 2.0  ·  Single-file HTML Application</w:t>
+        <w:t>Version 2.1  ·  Single-file HTML Application</w:t>
       </w:r>
     </w:p>
     <w:p>
@@ -5317,6 +5317,20 @@
     </w:p>
     <w:p>
       <w:pPr>
+        <w:pStyle w:val="ListBullet"/>
+        <w:ind w:left="432"/>
+      </w:pPr>
+      <w:r>
+        <w:rPr>
+          <w:rFonts w:ascii="Arial" w:hAnsi="Arial"/>
+          <w:i w:val="0"/>
+          <w:sz w:val="22"/>
+        </w:rPr>
+        <w:t>Beside the Duration fields, a live “→ ends 3:45 PM” preview updates as hours/minutes/start change, switching to “→ ends Wed, Jul 22 7:00 AM” when the duration crosses midnight — in both the New and Edit forms.</w:t>
+      </w:r>
+    </w:p>
+    <w:p>
+      <w:pPr>
         <w:pStyle w:val="Heading2"/>
       </w:pPr>
       <w:r>
@@ -5853,7 +5867,7 @@
           <w:i w:val="0"/>
           <w:sz w:val="22"/>
         </w:rPr>
-        <w:t>A "Link source" badge appears when another event feeds this event's departure.</w:t>
+        <w:t>NEW Event form: when the selected trip/category/start have chainable neighbors, two live checkboxes appear (both checked by default), each naming its exact target: “⛓ Attach to previous event: X” and “⛓ Attach to next event: Y.” They re-compute as the trip, category, or start time changes. Unchecking suppresses that link entirely — the checkboxes are the single source of truth, replacing the old silent auto-link on save.</w:t>
       </w:r>
     </w:p>
     <w:p>
@@ -5867,7 +5881,7 @@
           <w:i w:val="0"/>
           <w:sz w:val="22"/>
         </w:rPr>
-        <w:t>A "Link destination" badge appears when this event feeds the next.</w:t>
+        <w:t>The chain's effect is visible at creation time, not back-filled silently after save: a new driving event attaching to a previous stop/leg shows the inherited address in its Departure field, and one attaching to a named next stop shows that stop's address in Arrival — so “Get route” works immediately. Prefills only ever fill an empty field or replace their own earlier auto-fill (tracked via a marker); user-typed text is never touched, and unchecking clears only what was auto-filled. Label hints state the concrete effect (“fills its arrival” / “sets your departure”).</w:t>
       </w:r>
     </w:p>
     <w:p>
@@ -5881,13 +5895,22 @@
           <w:i w:val="0"/>
           <w:sz w:val="22"/>
         </w:rPr>
-        <w:t>A disconnect button removes the link.</w:t>
-      </w:r>
-    </w:p>
-    <w:p>
-      <w:pPr>
-        <w:spacing w:before="0" w:after="0"/>
-      </w:pPr>
+        <w:t>Candidates are always the CHRONOLOGICALLY nearest chainable events, even if already linked — inserting an event mid-chain SPLICES it: prev → new → next, with addresses propagating through both hops. An explicit attach-to-next also supersedes any other event's stale link into that target (a chain must never have two feeders).</w:t>
+      </w:r>
+    </w:p>
+    <w:p>
+      <w:pPr>
+        <w:pStyle w:val="ListBullet"/>
+        <w:ind w:left="432"/>
+      </w:pPr>
+      <w:r>
+        <w:rPr>
+          <w:rFonts w:ascii="Arial" w:hAnsi="Arial"/>
+          <w:i w:val="0"/>
+          <w:sz w:val="22"/>
+        </w:rPr>
+        <w:t>EDIT form: existing links show as “Linked to / Linked from” badges, each with its own Disconnect that severs only its own side (a shared handler once cut the wrong link on events linked in both directions). When a side is unlinked, a “🔗 Connect to next event” / “🔗 Connect to previous event” button appears, using the same splice semantics as creation.</w:t>
+      </w:r>
     </w:p>
     <w:p>
       <w:pPr>
@@ -9559,7 +9582,7 @@
           <w:i w:val="0"/>
           <w:sz w:val="22"/>
         </w:rPr>
-        <w:t>When something needs attention, a floating dismissible banner appears under the header (e.g. “☁ 'Alaska 2026' has newer data on GitHub · ✏ 'Yukon' has unsaved local changes — Open Sync”). Dismissing remembers that exact situation; the banner only reappears when the state changes. The header's cloud button additionally shows a small count badge while any trip needs attention, persisting quietly after the banner is dismissed.</w:t>
+        <w:t>The floating dismissible banner interrupts ONLY for what another device did — remote-ahead and diverged (e.g. “☁ 'Alaska 2026' has newer data on GitHub — Open Sync”). Unsaved LOCAL changes never trigger the banner (that would nag constantly mid-editing); they surface only via the cloud button's count badge and tooltip. Dismissing remembers that exact situation; the banner reappears only when the state changes.</w:t>
       </w:r>
     </w:p>
     <w:p>
@@ -9574,6 +9597,20 @@
           <w:sz w:val="22"/>
         </w:rPr>
         <w:t>Saving with identical content still records a sync point; renaming a trip carries its fingerprint to the new filename (the GitHub file keeps the old name until the next save); deleting a trip removes its fingerprint. Verdicts are only meaningful once a first save/load has been performed from a given device — until then a trip reads “not synced from this device yet.”</w:t>
+      </w:r>
+    </w:p>
+    <w:p>
+      <w:pPr>
+        <w:pStyle w:val="ListBullet"/>
+        <w:ind w:left="432"/>
+      </w:pPr>
+      <w:r>
+        <w:rPr>
+          <w:rFonts w:ascii="Arial" w:hAnsi="Arial"/>
+          <w:i w:val="0"/>
+          <w:sz w:val="22"/>
+        </w:rPr>
+        <w:t>All GitHub API calls bypass the browser's HTTP cache (cache: no-store) — GitHub responses carry max-age=60, and a cached listing made the checker claim “newer on GitHub” right after a save, and could feed stale file versions into the sha-safe write wrappers.</w:t>
       </w:r>
     </w:p>
     <w:p>

</xml_diff>

<commit_message>
Update spec doc 2026-07-29 16:09
</commit_message>
<xml_diff>
--- a/docs/Road Trip Planner — Specification.docx
+++ b/docs/Road Trip Planner — Specification.docx
@@ -42,7 +42,7 @@
           <w:color w:val="64748B"/>
           <w:sz w:val="22"/>
         </w:rPr>
-        <w:t>Version 2.1  ·  Single-file HTML Application</w:t>
+        <w:t>Version 2.2  ·  Single-file HTML Application</w:t>
       </w:r>
     </w:p>
     <w:p>
@@ -264,6 +264,20 @@
           <w:sz w:val="22"/>
         </w:rPr>
         <w:t>State is auto-saved on every mutation (add/edit/delete event or trip, navigate, drag, extend/compress, etc.).</w:t>
+      </w:r>
+    </w:p>
+    <w:p>
+      <w:pPr>
+        <w:pStyle w:val="ListBullet"/>
+        <w:ind w:left="432"/>
+      </w:pPr>
+      <w:r>
+        <w:rPr>
+          <w:rFonts w:ascii="Arial" w:hAnsi="Arial"/>
+          <w:i w:val="0"/>
+          <w:sz w:val="22"/>
+        </w:rPr>
+        <w:t>Same-device tab convergence: two tabs (or an iOS-frozen page revived later) share localStorage but keep separate in-memory copies, and a stale tab's save used to clobber everything a fresher tab had written. Any outside write is now adopted into memory immediately — via the cross-tab storage event and a check whenever the page becomes visible again — and re-rendered; adoption is deferred while the event form is open so it can't yank an editing session.</w:t>
       </w:r>
     </w:p>
     <w:p>
@@ -3243,6 +3257,20 @@
           <w:i w:val="0"/>
           <w:sz w:val="22"/>
         </w:rPr>
+        <w:t>Bars span EXACTLY their time range: an event ending at 5:00 PM and the next starting at 5:00 PM sit flush, separated only by their own borders (a thin consistent seam) — never a phantom gap. (Earlier versions inset every bar by 2px per side while also enforcing a minimum width, so touching events sometimes showed a gap and sometimes didn't.) A 4px minimum width remains purely as a clickability floor for sub-15-minute slivers.</w:t>
+      </w:r>
+    </w:p>
+    <w:p>
+      <w:pPr>
+        <w:pStyle w:val="ListBullet"/>
+        <w:ind w:left="432"/>
+      </w:pPr>
+      <w:r>
+        <w:rPr>
+          <w:rFonts w:ascii="Arial" w:hAnsi="Arial"/>
+          <w:i w:val="0"/>
+          <w:sz w:val="22"/>
+        </w:rPr>
         <w:t>Colors are determined by event category (see Section 6).</w:t>
       </w:r>
     </w:p>
@@ -3430,7 +3458,21 @@
           <w:i w:val="0"/>
           <w:sz w:val="22"/>
         </w:rPr>
-        <w:t>Colored visibility dot — clicking toggles visibility of the trip's events on the calendar.</w:t>
+        <w:t>Each trip renders as TWO lines, so the name is no longer squeezed by the action icons: line 1 holds the visibility checkbox, color dot, and the trip name at full remaining width; line 2 holds the action icons, aligned under the name. On mobile the icons grow to finger size (34×30px) and spread evenly across the row.</w:t>
+      </w:r>
+    </w:p>
+    <w:p>
+      <w:pPr>
+        <w:pStyle w:val="ListBullet"/>
+        <w:ind w:left="432"/>
+      </w:pPr>
+      <w:r>
+        <w:rPr>
+          <w:rFonts w:ascii="Arial" w:hAnsi="Arial"/>
+          <w:i w:val="0"/>
+          <w:sz w:val="22"/>
+        </w:rPr>
+        <w:t>Visibility checkbox (trip color) — toggles visibility of the trip's events on the calendar.</w:t>
       </w:r>
     </w:p>
     <w:p>
@@ -6692,6 +6734,20 @@
           <w:i w:val="0"/>
           <w:sz w:val="22"/>
         </w:rPr>
+        <w:t>The buttons hide entirely while any pop-in is open (event form, Trip Summary, photo import, Sync, Share, or the photo lightbox) — they must never float on top of a modal — and reappear when it closes.</w:t>
+      </w:r>
+    </w:p>
+    <w:p>
+      <w:pPr>
+        <w:pStyle w:val="ListBullet"/>
+        <w:ind w:left="432"/>
+      </w:pPr>
+      <w:r>
+        <w:rPr>
+          <w:rFonts w:ascii="Arial" w:hAnsi="Arial"/>
+          <w:i w:val="0"/>
+          <w:sz w:val="22"/>
+        </w:rPr>
         <w:t>Each button is disabled (grayed) when there is nothing to undo/redo.</w:t>
       </w:r>
     </w:p>
@@ -9125,7 +9181,7 @@
           <w:i w:val="0"/>
           <w:sz w:val="22"/>
         </w:rPr>
-        <w:t>Maximum height is 92 vh; the sheet is scrollable internally.</w:t>
+        <w:t>Maximum height is measured from BELOW the fixed mobile header (calc(100dvh − header − 8px), dvh so iOS Safari's collapsing toolbars are handled): a flat 92vh once let a tall form slide its top rows — including the sticky nav/debug row — underneath the menu bar, unreachable. The sheet scrolls internally.</w:t>
       </w:r>
     </w:p>
     <w:p>
@@ -9278,7 +9334,21 @@
           <w:i w:val="0"/>
           <w:sz w:val="22"/>
         </w:rPr>
-        <w:t>Saving first shows a checklist of every local trip that has events, each badged with its sync verdict (Section 18.6) — only the checked trips are written. Defaults follow the verdict: trips with unsaved local changes or new trips are pre-checked; in-sync trips aren't (nothing to do); trips whose save would overwrite a NEWER version from another device (remote-ahead or diverged) start unchecked and must be opted into deliberately.</w:t>
+        <w:t>The Sync modal shows ONE selection list immediately on open (no extra click needed): every local trip with its live verdict badge (Section 18.6) plus any trips that exist only on GitHub, each with a checkbox (plus select/deselect-all). Save and Load act directly on the checked trips, and each button stays DISABLED until at least one applicable trip is checked (Save needs a checked local trip; Load a checked trip that exists on GitHub). Selection resets each time the modal opens.</w:t>
+      </w:r>
+    </w:p>
+    <w:p>
+      <w:pPr>
+        <w:pStyle w:val="ListBullet"/>
+        <w:ind w:left="432"/>
+      </w:pPr>
+      <w:r>
+        <w:rPr>
+          <w:rFonts w:ascii="Arial" w:hAnsi="Arial"/>
+          <w:i w:val="0"/>
+          <w:sz w:val="22"/>
+        </w:rPr>
+        <w:t>Saving a trip that is remote-ahead or diverged (another device saved newer data) asks for explicit confirmation first, reminding that the overwritten version is archived to /data/history/.</w:t>
       </w:r>
     </w:p>
     <w:p>
@@ -9375,7 +9445,7 @@
           <w:i w:val="0"/>
           <w:sz w:val="22"/>
         </w:rPr>
-        <w:t>Loading first lists the .csv trip files in /data/ as a checklist, each badged with its sync verdict (Section 18.6). Defaults follow the verdict: “newer on GitHub,” new, and never-synced trips are pre-checked; a trip whose load would DISCARD unsaved local edits (local-ahead or diverged) is never pre-checked. Only checked trips are imported (same format as local CSV import).</w:t>
+        <w:t>Load imports the trips checked in the modal's selection list (same format as local CSV import).</w:t>
       </w:r>
     </w:p>
     <w:p>
@@ -9389,7 +9459,7 @@
           <w:i w:val="0"/>
           <w:sz w:val="22"/>
         </w:rPr>
-        <w:t>The slide-to-confirm gesture (drag the thumb to the right end of the track) gates the load only when at least one checked trip would replace a local one; the warning states how many, and names any trips whose unsaved local edits would be discarded. Loading only new trips proceeds without the gate.</w:t>
+        <w:t>Overriding loads are confirmed by PRESS-AND-HOLD on the Load button itself (replacing the old slide-to-confirm panel): when the selection would replace local copies, the button's own label states the stakes up front — e.g. “⬇ Hold — 2 trips overwritten by GitHub ⚠” (the ⚠ appears when unsaved local edits are among them, detailed in the tooltip). Holding sweeps a progress fill across the button for 1.5s and the load fires only when it completes; releasing early cancels harmlessly, and a short tap prints a hint explaining the gesture. Selections that replace nothing local load on a plain click, no hold needed.</w:t>
       </w:r>
     </w:p>
     <w:p>
@@ -10370,7 +10440,7 @@
           <w:i w:val="0"/>
           <w:sz w:val="22"/>
         </w:rPr>
-        <w:t>Every &lt;img&gt; rendering a photo URL — in the event form, the popover, and the Trip Summary grid — has an onerror handler (hideBrokenPhotoThumb()) that removes the thumbnail element from the DOM entirely (or its enclosing card, in the event form, so the ✕ remove button disappears with it) and collapses the surrounding container if that was its only photo. No placeholder icon, dashed border, or tooltip is shown — visually, it is as if the photo was never there.</w:t>
+        <w:t>Every &lt;img&gt; rendering a photo URL — in the event form, the popover, and the Trip Summary grid — first RETRIES a failed load a few times with increasing delays (2s/5s/12s), each attempt cache-busted with a query parameter: raw.githubusercontent serves (and caches!) 404s for freshly-uploaded files for several minutes, which once made photos synced from another device “vanish” everywhere — including on the uploading device after a refresh — while the files sat safely on GitHub. Only after the retries fail is the thumbnail removed from the DOM entirely (or its enclosing card in the event form) and the container collapsed if empty — the correct behavior for genuinely-deleted photos. The full-screen lightbox performs one cache-busted retry before advancing past a broken photo.</w:t>
       </w:r>
     </w:p>
     <w:p>

</xml_diff>

<commit_message>
Update spec doc 2026-07-29 16:19
</commit_message>
<xml_diff>
--- a/docs/Road Trip Planner — Specification.docx
+++ b/docs/Road Trip Planner — Specification.docx
@@ -42,7 +42,7 @@
           <w:color w:val="64748B"/>
           <w:sz w:val="22"/>
         </w:rPr>
-        <w:t>Version 2.2  ·  Single-file HTML Application</w:t>
+        <w:t>Version 2.3  ·  Single-file HTML Application</w:t>
       </w:r>
     </w:p>
     <w:p>
@@ -5658,6 +5658,20 @@
           <w:i w:val="0"/>
           <w:sz w:val="22"/>
         </w:rPr>
+        <w:t>While the popover is open, the ← / → arrow keys step through the trip's events exactly like the ‹ › buttons (the photo lightbox keeps priority for arrows while it's open on top, and keystrokes aimed at an input field are ignored).</w:t>
+      </w:r>
+    </w:p>
+    <w:p>
+      <w:pPr>
+        <w:pStyle w:val="ListBullet"/>
+        <w:ind w:left="432"/>
+      </w:pPr>
+      <w:r>
+        <w:rPr>
+          <w:rFonts w:ascii="Arial" w:hAnsi="Arial"/>
+          <w:i w:val="0"/>
+          <w:sz w:val="22"/>
+        </w:rPr>
         <w:t>Close button (✕) is pinned to the popover's absolute top-right corner, separate from the action row. Click-outside also closes the popover.</w:t>
       </w:r>
     </w:p>
@@ -6734,7 +6748,7 @@
           <w:i w:val="0"/>
           <w:sz w:val="22"/>
         </w:rPr>
-        <w:t>The buttons hide entirely while any pop-in is open (event form, Trip Summary, photo import, Sync, Share, or the photo lightbox) — they must never float on top of a modal — and reappear when it closes.</w:t>
+        <w:t>The buttons hide entirely while any pop-in is open (event preview popover, event form, Trip Summary, photo import, Sync, Share, or the photo lightbox) — they must never float on top of a modal — and reappear when it closes.</w:t>
       </w:r>
     </w:p>
     <w:p>
@@ -9459,7 +9473,7 @@
           <w:i w:val="0"/>
           <w:sz w:val="22"/>
         </w:rPr>
-        <w:t>Overriding loads are confirmed by PRESS-AND-HOLD on the Load button itself (replacing the old slide-to-confirm panel): when the selection would replace local copies, the button's own label states the stakes up front — e.g. “⬇ Hold — 2 trips overwritten by GitHub ⚠” (the ⚠ appears when unsaved local edits are among them, detailed in the tooltip). Holding sweeps a progress fill across the button for 1.5s and the load fires only when it completes; releasing early cancels harmlessly, and a short tap prints a hint explaining the gesture. Selections that replace nothing local load on a plain click, no hold needed.</w:t>
+        <w:t>Overriding loads are confirmed by PRESS-AND-HOLD on the Load button itself (replacing the old slide-to-confirm panel). Two-stage single-line label: at rest, a selection that would replace local copies makes the button read “⬇ Hold to load from GitHub” (details in the tooltip); WHILE the hold is active and the progress fill sweeps across the button (1.5s), the label switches to the concrete stakes — “⬇ Overwriting X trip(s)”, with a ⚠ when unsaved local edits are among them. The load fires only when the fill completes; releasing early cancels and restores the resting label, and a short tap prints a hint explaining the gesture. Selections that replace nothing local load on a plain click, no hold needed.</w:t>
       </w:r>
     </w:p>
     <w:p>

</xml_diff>

<commit_message>
Update spec doc 2026-07-31 10:30
</commit_message>
<xml_diff>
--- a/docs/Road Trip Planner — Specification.docx
+++ b/docs/Road Trip Planner — Specification.docx
@@ -42,7 +42,7 @@
           <w:color w:val="64748B"/>
           <w:sz w:val="22"/>
         </w:rPr>
-        <w:t>Version 2.3  ·  Single-file HTML Application</w:t>
+        <w:t>Version 2.4  ·  Single-file HTML Application</w:t>
       </w:r>
     </w:p>
     <w:p>
@@ -4756,7 +4756,7 @@
           <w:i w:val="0"/>
           <w:sz w:val="22"/>
         </w:rPr>
-        <w:t>Debug mode: a deliberately discreet 🐞 toggle inside the New Event form's own header row (hidden when editing; state persisted in localStorage). The reasoning is captured whenever a New Event form opens, so the toggle works retroactively: if a suggested trip/time looks weird, tapping 🐞 right then reveals a plain-language box explaining THAT form's defaults — the clicked time, which rule chose the trip, how many of that trip's events were considered, the anchor event whose end became the suggested start, and how many later-that-day events were ignored.</w:t>
+        <w:t>Debug mode: a deliberately discreet, global 🐞 toggle at the bottom-left of the trip sidebar (state persisted in localStorage). The reasoning is captured whenever a New Event form opens, so the toggle works retroactively: if a suggested trip/time looks weird, enabling debug reveals a plain-language box explaining THAT form's defaults — the clicked time, which rule chose the trip, how many of that trip's events were considered, the anchor event whose end became the suggested start, and how many later-that-day events were ignored.</w:t>
       </w:r>
     </w:p>
     <w:p>
@@ -7211,6 +7211,15 @@
     </w:p>
     <w:p>
       <w:pPr>
+        <w:pStyle w:val="ListBullet"/>
+        <w:ind w:left="432"/>
+      </w:pPr>
+      <w:r>
+        <w:t>Robust record parsing: CSV files are split into records by a quote-aware parser (parseCSVRows) rather than by line, so multi-line descriptions — which are legal CSV inside quoted fields — survive round-trips intact. Both this import path and the GitHub Sync loader share the parser; naive line-splitting previously truncated such events’ descriptions and dropped every column after them (departure/arrival, photos, links).</w:t>
+      </w:r>
+    </w:p>
+    <w:p>
+      <w:pPr>
         <w:spacing w:before="0" w:after="0"/>
       </w:pPr>
     </w:p>
@@ -7353,6 +7362,33 @@
           <w:sz w:val="22"/>
         </w:rPr>
         <w:t>Photo filter: a button next to the search box cycling All → With photos → Without photos (color-coded when active). It combines with the text search (both must match) — e.g. “sleeping” + Without photos lists the hotels that still need pictures.</w:t>
+      </w:r>
+    </w:p>
+    <w:p>
+      <w:pPr>
+        <w:pStyle w:val="ListBullet"/>
+        <w:ind w:left="432"/>
+      </w:pPr>
+      <w:r>
+        <w:t>Distance-comparison widget: under the stats bar, the total driven distance is restated against a ladder of fun references, picking the most flattering tier — crossings of Colorado 🏔 (610 km), USA coast-to-coast 🇺🇸 (4,500 km), fraction of Earth’s circumference 🌍 (40,075 km), and progress toward the Moon 🌕 (384,400 km) — each with a progress bar and a single-line quip.</w:t>
+      </w:r>
+    </w:p>
+    <w:p>
+      <w:pPr>
+        <w:pStyle w:val="ListBullet"/>
+        <w:ind w:left="432"/>
+      </w:pPr>
+      <w:r>
+        <w:t>Full-trip overview map: below the widget, one large Leaflet map (550px tall on desktop, 460px on mobile; per-leg maps stay 200px) draws every driving leg of the trip end to end — see Section 20.7.</w:t>
+      </w:r>
+    </w:p>
+    <w:p>
+      <w:pPr>
+        <w:pStyle w:val="ListBullet"/>
+        <w:ind w:left="432"/>
+      </w:pPr>
+      <w:r>
+        <w:t>While any search or photo filter is active, the overview map, the distance widget, its note, and the full-route Maps button are hidden so results stay compact.</w:t>
       </w:r>
     </w:p>
     <w:p>
@@ -7726,6 +7762,59 @@
     </w:p>
     <w:p>
       <w:pPr>
+        <w:pStyle w:val="Heading2"/>
+        <w:ind w:left="432"/>
+      </w:pPr>
+      <w:r>
+        <w:t>14.7  Edit Mode</w:t>
+      </w:r>
+    </w:p>
+    <w:p>
+      <w:pPr>
+        <w:ind w:left="432"/>
+      </w:pPr>
+      <w:r>
+        <w:t>A 🖊 Edit button in the modal header (next to Print) toggles an in-place edit mode for the trip, turning the read-oriented summary into a light editor. It always starts OFF when the modal opens, and is hidden entirely in read-only shared views.</w:t>
+      </w:r>
+    </w:p>
+    <w:p>
+      <w:pPr>
+        <w:pStyle w:val="ListBullet"/>
+        <w:ind w:left="432"/>
+      </w:pPr>
+      <w:r>
+        <w:t>Titles and descriptions become editable in place (contenteditable, plaintext-only): dashed outlines mark editable fields, focus shows a solid outline, and events without notes show an “Add notes…” placeholder. Enter commits a title (single-line), Escape reverts a field without closing the modal, and clicking away saves. Empty titles revert; a multi-day event’s title stays in sync across all its day cards; the calendar re-renders behind the modal and the summary’s search index absorbs the new text immediately.</w:t>
+      </w:r>
+    </w:p>
+    <w:p>
+      <w:pPr>
+        <w:pStyle w:val="ListBullet"/>
+        <w:ind w:left="432"/>
+      </w:pPr>
+      <w:r>
+        <w:t>Every photo thumbnail gains a red ✕ badge; clicking it (after a confirm) removes the photo from the event and deletes the stored image from GitHub, surgically re-rendering only that event’s grid.</w:t>
+      </w:r>
+    </w:p>
+    <w:p>
+      <w:pPr>
+        <w:pStyle w:val="ListBullet"/>
+        <w:ind w:left="432"/>
+      </w:pPr>
+      <w:r>
+        <w:t>Each event card gains a pencil button overlaid on the top-right corner of the title’s dashed edit box; it closes the summary and opens that event in the full event editor.</w:t>
+      </w:r>
+    </w:p>
+    <w:p>
+      <w:pPr>
+        <w:pStyle w:val="ListBullet"/>
+        <w:ind w:left="432"/>
+      </w:pPr>
+      <w:r>
+        <w:t>Layout stability: toggling edit mode never shifts content. Thumbnails are display:block (no inline-baseline gap when wrapped for the ✕ badge), empty description slots permanently reserve their edit-mode height (collapsed only in print), and the pencil is an absolutely-positioned overlay that takes no layout space.</w:t>
+      </w:r>
+    </w:p>
+    <w:p>
+      <w:pPr>
         <w:spacing w:before="0" w:after="0"/>
       </w:pPr>
     </w:p>
@@ -7734,7 +7823,7 @@
         <w:pStyle w:val="Heading2"/>
       </w:pPr>
       <w:r>
-        <w:t>14.7  Closing</w:t>
+        <w:t>14.8  Closing</w:t>
       </w:r>
     </w:p>
     <w:p>
@@ -9769,7 +9858,7 @@
           <w:i w:val="0"/>
           <w:sz w:val="22"/>
         </w:rPr>
-        <w:t>The trip and its events are serialized to JSON (not CSV, so there is no URL length limit) and uploaded to /shared/{slug}-{8-hex}.json in the configured GitHub repository, reusing the same token as CSV sync.</w:t>
+        <w:t>The trip and its events are serialized to JSON (not CSV, so there is no URL length limit) and uploaded to /shared/{slug}.json in the configured GitHub repository, reusing the same token as CSV sync. The slug is the trip’s CSV-filename key, so the share id is CANONICAL: one link per trip, identical from every device, and re-sharing refreshes the same file instead of minting a new one.</w:t>
       </w:r>
     </w:p>
     <w:p>
@@ -9783,7 +9872,34 @@
           <w:i w:val="0"/>
           <w:sz w:val="22"/>
         </w:rPr>
-        <w:t>The resulting URL is https://{owner}.github.io/{repo}/?share={id} and is shown in a copyable share modal.</w:t>
+        <w:t>The resulting URL is https://{owner}.github.io/{repo}/?share={slug} and is shown in a copyable share modal.</w:t>
+      </w:r>
+    </w:p>
+    <w:p>
+      <w:pPr>
+        <w:pStyle w:val="ListBullet"/>
+        <w:ind w:left="432"/>
+      </w:pPr>
+      <w:r>
+        <w:t>Always fresh: every “Save to GitHub” also refreshes the shared payload of any trip that has ever been shared (identified by an existing canonical file or a legacy snapshot in /shared/), so everyone holding the link sees the latest synced data. Never-shared trips publish nothing. No-op refreshes are skipped by comparing payloads (ignoring generatedAt) to avoid commit churn.</w:t>
+      </w:r>
+    </w:p>
+    <w:p>
+      <w:pPr>
+        <w:pStyle w:val="ListBullet"/>
+        <w:ind w:left="432"/>
+      </w:pPr>
+      <w:r>
+        <w:t>Renames: a renamed trip changes slug, so both Share and the save-time refresh leave a small {redirect: newSlug} pointer file at the old address; previously distributed links follow the trip to its new name. The last-used slug is remembered per trip (trip.shareSlug).</w:t>
+      </w:r>
+    </w:p>
+    <w:p>
+      <w:pPr>
+        <w:pStyle w:val="ListBullet"/>
+        <w:ind w:left="432"/>
+      </w:pPr>
+      <w:r>
+        <w:t>Legacy links: share ids minted before this scheme were random {slug}-{8 hex} frozen snapshots, and many are in the wild. The viewer recognizes the pattern, tries the canonical live file FIRST, follows up to 3 redirect hops, and only falls back to the frozen legacy snapshot if no canonical file exists yet — so old links never break, and they automatically upgrade to live data after the owner’s next save or re-share of that trip.</w:t>
       </w:r>
     </w:p>
     <w:p>
@@ -9805,7 +9921,7 @@
           <w:i w:val="0"/>
           <w:sz w:val="22"/>
         </w:rPr>
-        <w:t>On load, the app checks for a ?share= query parameter before doing anything else. If present, it fetches the JSON payload from raw.githubusercontent.com and enters read-only mode, ignoring any trips/events already saved in the visitor's own localStorage.</w:t>
+        <w:t>On load, the app checks for a ?share= query parameter before doing anything else. If present, it resolves the id as above and fetches the JSON payload from raw.githubusercontent.com (cache-busted, so viewers never see a CDN-stale copy) and enters read-only mode, ignoring any trips/events already saved in the visitor’s own localStorage. The browser tab title is set to the trip’s name instead of “Road Trip Planner.”</w:t>
       </w:r>
     </w:p>
     <w:p>
@@ -9880,6 +9996,9 @@
         </w:rPr>
         <w:t>A body.read-only CSS class hides every editing control app-wide: New Event, GitHub sync, New Trip, Import Trip, the event popover's Edit button, and each trip's Delete/Rename/Share buttons in the sidebar. The Trip Summary's own Print/Export and Trip Summary/Route Map viewing controls remain visible, since viewing is the entire point of a shared link.</w:t>
       </w:r>
+      <w:r>
+        <w:t xml:space="preserve"> The Trip Summary’s 🖊 Edit mode (Section 14.7) is likewise unavailable: the Edit button and per-event pencil buttons are hidden and the handlers no-op in read-only mode.</w:t>
+      </w:r>
     </w:p>
     <w:p>
       <w:pPr>
@@ -10153,6 +10272,60 @@
     </w:p>
     <w:p>
       <w:pPr>
+        <w:pStyle w:val="Heading2"/>
+      </w:pPr>
+      <w:r>
+        <w:t>20.7  Full-Trip Overview Map</w:t>
+      </w:r>
+    </w:p>
+    <w:p>
+      <w:pPr/>
+      <w:r>
+        <w:t>The Trip Summary also renders ONE overview map of the entire trip (container #leg-map-overview, excluded from the per-leg initializer), sized 550px tall on desktop and 460px on mobile, beneath the distance-comparison widget.</w:t>
+      </w:r>
+    </w:p>
+    <w:p>
+      <w:pPr>
+        <w:pStyle w:val="ListBullet"/>
+      </w:pPr>
+      <w:r>
+        <w:t>Every driving leg’s geocoded endpoints and OSRM geometry are drawn on the one map; legs still missing a route draw as dashed straight lines. Bounds accumulate via a plain loop (not spread — argument limits) and fit with padding; a cluster check rejects geocode outliers more than 1,500 miles from the trip’s point cluster rather than zooming out to a wrong continent.</w:t>
+      </w:r>
+    </w:p>
+    <w:p>
+      <w:pPr>
+        <w:pStyle w:val="ListBullet"/>
+      </w:pPr>
+      <w:r>
+        <w:t>Gap connectors: when one leg’s arrival differs from the next leg’s departure by more than a mile, a dotted gray connector joins them so the chain reads continuously without implying a driven road.</w:t>
+      </w:r>
+    </w:p>
+    <w:p>
+      <w:pPr>
+        <w:pStyle w:val="ListBullet"/>
+      </w:pPr>
+      <w:r>
+        <w:t>Stale-route validation: cached OSRM geometry is checked against the leg’s current endpoints (25-mile tolerance, routeMatchesEndpoints); mismatches — e.g. after editing addresses — are discarded and refetched automatically.</w:t>
+      </w:r>
+    </w:p>
+    <w:p>
+      <w:pPr>
+        <w:pStyle w:val="ListBullet"/>
+      </w:pPr>
+      <w:r>
+        <w:t>Loading UX: a progress counter (“Loading trip map… leg N/M”) plays during cold-cache loads, which are throttled at 1.1s per leg only when the geocoder is needed (300ms router-only). A ↺ button clears the trip’s geo and route caches and rebuilds; per-leg draw errors are isolated by try/catch. With debug mode on, a diagnostics box lists each leg’s resolution (route ✓(pts, endpoints) / fallback / reason skipped).</w:t>
+      </w:r>
+    </w:p>
+    <w:p>
+      <w:pPr>
+        <w:pStyle w:val="ListBullet"/>
+      </w:pPr>
+      <w:r>
+        <w:t>Each per-leg map keeps its own 200px embed; only the overview is large. The overview hides while search/photo filters are active (Section 14.2).</w:t>
+      </w:r>
+    </w:p>
+    <w:p>
+      <w:pPr>
         <w:spacing w:before="0" w:after="0"/>
       </w:pPr>
     </w:p>
@@ -11085,6 +11258,15 @@
           <w:sz w:val="22"/>
         </w:rPr>
         <w:t>Each review card renders defensively — a malformed entry falls back to a “Couldn't display this photo” card with a Discard button instead of taking down the whole panel. Photos not yet visible on another device retry with backoff and then explain CDN sync lag instead of showing a broken image.</w:t>
+      </w:r>
+    </w:p>
+    <w:p>
+      <w:pPr>
+        <w:pStyle w:val="ListBullet"/>
+        <w:ind w:left="432"/>
+      </w:pPr>
+      <w:r>
+        <w:t>Stable dropdowns: while photos are still processing, background re-renders of the review panel are DEFERRED whenever a &lt;select&gt; inside it currently has focus (the re-render used to destroy the open dropdown mid-choice). The pending render flushes on the select’s change or focusout, preserving scroll position and selections.</w:t>
       </w:r>
     </w:p>
     <w:p>

</xml_diff>

<commit_message>
Update spec doc 2026-07-31 11:14
</commit_message>
<xml_diff>
--- a/docs/Road Trip Planner — Specification.docx
+++ b/docs/Road Trip Planner — Specification.docx
@@ -42,7 +42,7 @@
           <w:color w:val="64748B"/>
           <w:sz w:val="22"/>
         </w:rPr>
-        <w:t>Version 2.4  ·  Single-file HTML Application</w:t>
+        <w:t>Version 2.5  ·  Single-file HTML Application</w:t>
       </w:r>
     </w:p>
     <w:p>
@@ -2356,6 +2356,74 @@
         <w:tc>
           <w:tcPr>
             <w:tcW w:type="dxa" w:w="2304"/>
+            <w:shd w:val="clear" w:color="auto" w:fill="FFFFFF"/>
+            <w:tcBorders>
+              <w:top w:val="single" w:sz="4" w:space="0" w:color="DDDDDD"/>
+              <w:left w:val="single" w:sz="4" w:space="0" w:color="DDDDDD"/>
+              <w:bottom w:val="single" w:sz="4" w:space="0" w:color="DDDDDD"/>
+              <w:right w:val="single" w:sz="4" w:space="0" w:color="DDDDDD"/>
+            </w:tcBorders>
+          </w:tcPr>
+          <w:p>
+            <w:r>
+              <w:rPr>
+                <w:rFonts w:ascii="Arial" w:hAnsi="Arial"/>
+                <w:b/>
+                <w:sz w:val="20"/>
+              </w:rPr>
+              <w:t>miscAddress</w:t>
+            </w:r>
+          </w:p>
+        </w:tc>
+        <w:tc>
+          <w:tcPr>
+            <w:tcW w:type="dxa" w:w="1584"/>
+            <w:shd w:val="clear" w:color="auto" w:fill="FFFFFF"/>
+            <w:tcBorders>
+              <w:top w:val="single" w:sz="4" w:space="0" w:color="DDDDDD"/>
+              <w:left w:val="single" w:sz="4" w:space="0" w:color="DDDDDD"/>
+              <w:bottom w:val="single" w:sz="4" w:space="0" w:color="DDDDDD"/>
+              <w:right w:val="single" w:sz="4" w:space="0" w:color="DDDDDD"/>
+            </w:tcBorders>
+          </w:tcPr>
+          <w:p>
+            <w:r>
+              <w:rPr>
+                <w:rFonts w:ascii="Arial" w:hAnsi="Arial"/>
+                <w:b w:val="0"/>
+                <w:sz w:val="20"/>
+              </w:rPr>
+              <w:t>string</w:t>
+            </w:r>
+          </w:p>
+        </w:tc>
+        <w:tc>
+          <w:tcPr>
+            <w:tcW w:type="dxa" w:w="5040"/>
+            <w:shd w:val="clear" w:color="auto" w:fill="FFFFFF"/>
+            <w:tcBorders>
+              <w:top w:val="single" w:sz="4" w:space="0" w:color="DDDDDD"/>
+              <w:left w:val="single" w:sz="4" w:space="0" w:color="DDDDDD"/>
+              <w:bottom w:val="single" w:sz="4" w:space="0" w:color="DDDDDD"/>
+              <w:right w:val="single" w:sz="4" w:space="0" w:color="DDDDDD"/>
+            </w:tcBorders>
+          </w:tcPr>
+          <w:p>
+            <w:r>
+              <w:rPr>
+                <w:rFonts w:ascii="Arial" w:hAnsi="Arial"/>
+                <w:b w:val="0"/>
+                <w:sz w:val="20"/>
+              </w:rPr>
+              <w:t>(Misc only) Optional location name or address</w:t>
+            </w:r>
+          </w:p>
+        </w:tc>
+      </w:tr>
+      <w:tr>
+        <w:tc>
+          <w:tcPr>
+            <w:tcW w:type="dxa" w:w="2304"/>
             <w:shd w:val="clear" w:color="auto" w:fill="F0F4F8"/>
             <w:tcBorders>
               <w:top w:val="single" w:sz="4" w:space="0" w:color="DDDDDD"/>
@@ -5351,6 +5419,52 @@
           </w:p>
         </w:tc>
       </w:tr>
+      <w:tr>
+        <w:tc>
+          <w:tcPr>
+            <w:tcW w:type="dxa" w:w="2160"/>
+            <w:shd w:val="clear" w:color="auto" w:fill="F0F4F8"/>
+            <w:tcBorders>
+              <w:top w:val="single" w:sz="4" w:space="0" w:color="DDDDDD"/>
+              <w:left w:val="single" w:sz="4" w:space="0" w:color="DDDDDD"/>
+              <w:bottom w:val="single" w:sz="4" w:space="0" w:color="DDDDDD"/>
+              <w:right w:val="single" w:sz="4" w:space="0" w:color="DDDDDD"/>
+            </w:tcBorders>
+          </w:tcPr>
+          <w:p>
+            <w:r>
+              <w:rPr>
+                <w:rFonts w:ascii="Arial" w:hAnsi="Arial"/>
+                <w:b/>
+                <w:sz w:val="20"/>
+              </w:rPr>
+              <w:t>Location (optional)</w:t>
+            </w:r>
+          </w:p>
+        </w:tc>
+        <w:tc>
+          <w:tcPr>
+            <w:tcW w:type="dxa" w:w="6768"/>
+            <w:shd w:val="clear" w:color="auto" w:fill="F0F4F8"/>
+            <w:tcBorders>
+              <w:top w:val="single" w:sz="4" w:space="0" w:color="DDDDDD"/>
+              <w:left w:val="single" w:sz="4" w:space="0" w:color="DDDDDD"/>
+              <w:bottom w:val="single" w:sz="4" w:space="0" w:color="DDDDDD"/>
+              <w:right w:val="single" w:sz="4" w:space="0" w:color="DDDDDD"/>
+            </w:tcBorders>
+          </w:tcPr>
+          <w:p>
+            <w:r>
+              <w:rPr>
+                <w:rFonts w:ascii="Arial" w:hAnsi="Arial"/>
+                <w:b w:val="0"/>
+                <w:sz w:val="20"/>
+              </w:rPr>
+              <w:t>(Misc) Optional name/address with autocomplete; 📍 icon links to Google Maps search. Dining and Sightseeing have equivalent fields.</w:t>
+            </w:r>
+          </w:p>
+        </w:tc>
+      </w:tr>
     </w:tbl>
     <w:p>
       <w:pPr>
@@ -5855,7 +5969,7 @@
           <w:i w:val="0"/>
           <w:sz w:val="22"/>
         </w:rPr>
-        <w:t>Events that carry a location (driving, sleeping, dining, sightseeing) can be linked in a chain. The address of one event automatically seeds the departure/arrival of the next driving event, allowing a full multi-leg itinerary to be built incrementally. Any event with an address field, or any event already in a chain, is chainable.</w:t>
+        <w:t>Events that carry a location (driving, sleeping, dining, sightseeing, and misc with a location set) can be linked in a chain. The address of one event automatically seeds the departure/arrival of the next driving event, allowing a full multi-leg itinerary to be built incrementally. Any event with an address field, or any event already in a chain, is chainable.</w:t>
       </w:r>
     </w:p>
     <w:p>
@@ -7059,6 +7173,15 @@
         <w:ind w:left="432"/>
       </w:pPr>
       <w:r>
+        <w:t>misc_address</w:t>
+      </w:r>
+    </w:p>
+    <w:p>
+      <w:pPr>
+        <w:pStyle w:val="ListBullet"/>
+        <w:ind w:left="432"/>
+      </w:pPr>
+      <w:r>
         <w:rPr>
           <w:rFonts w:ascii="Arial" w:hAnsi="Arial"/>
           <w:i w:val="0"/>
@@ -7541,6 +7664,15 @@
           <w:sz w:val="22"/>
         </w:rPr>
         <w:t>Sightseeing and Transportation events: "📍 Find on map" link using the event title as a Maps search query.</w:t>
+      </w:r>
+    </w:p>
+    <w:p>
+      <w:pPr>
+        <w:pStyle w:val="ListBullet"/>
+        <w:ind w:left="432"/>
+      </w:pPr>
+      <w:r>
+        <w:t>Misc events with a location: pink address chip (matching the category color) with a “View on map” link.</w:t>
       </w:r>
     </w:p>
     <w:p>
@@ -9802,6 +9934,66 @@
     </w:p>
     <w:p>
       <w:pPr>
+        <w:pStyle w:val="Heading2"/>
+        <w:ind w:left="432"/>
+      </w:pPr>
+      <w:r>
+        <w:t>18.7  Trip Renames — Cross-Device Propagation</w:t>
+      </w:r>
+    </w:p>
+    <w:p>
+      <w:pPr/>
+      <w:r>
+        <w:t>A trip’s CSV filename (its slug) is its cross-device identity, so renaming a trip would normally strand files and confuse other devices. Renames are instead made fully transparent:</w:t>
+      </w:r>
+    </w:p>
+    <w:p>
+      <w:pPr>
+        <w:pStyle w:val="ListBullet"/>
+        <w:ind w:left="432"/>
+      </w:pPr>
+      <w:r>
+        <w:t>On the renaming device: the rename is instant and local. The sync fingerprint is carried from the old filename key to the new one, and the retired filename is queued on the trip (trip.prevFilenames).</w:t>
+      </w:r>
+    </w:p>
+    <w:p>
+      <w:pPr>
+        <w:pStyle w:val="ListBullet"/>
+        <w:ind w:left="432"/>
+      </w:pPr>
+      <w:r>
+        <w:t>On that device’s next save (even a content-unchanged one): the CSV is written under the new name first; only then is the old file retired — archived to data/history/ (with a “-renamed” device tag) and deleted from data/ — and the rename appended to a shared ledger, data/renames.json ({old, new, newName, at}, newest mapping per source file wins, capped at 50 entries). A failed cleanup stays queued and retries on the next save.</w:t>
+      </w:r>
+    </w:p>
+    <w:p>
+      <w:pPr>
+        <w:pStyle w:val="ListBullet"/>
+        <w:ind w:left="432"/>
+      </w:pPr>
+      <w:r>
+        <w:t>On every other device: whenever the periodic sync check (Section 18.6) finds that a previously-synced local trip’s file has vanished from the remote listing, it consults the ledger and renames its local copy to follow — automatically, carrying the sync fingerprint. A rename is only followed if the target file exists remotely, and never if it would collide with a different local trip already using that name.</w:t>
+      </w:r>
+    </w:p>
+    <w:p>
+      <w:pPr>
+        <w:pStyle w:val="ListBullet"/>
+        <w:ind w:left="432"/>
+      </w:pPr>
+      <w:r>
+        <w:t>Honest verdicts after following: if the device’s content now equals the remote file it records an in-sync point; if it was clean before the rename it shows remote-ahead (the rename-save carried other edits); only real local edits produce diverged.</w:t>
+      </w:r>
+    </w:p>
+    <w:p>
+      <w:pPr>
+        <w:pStyle w:val="ListBullet"/>
+        <w:ind w:left="432"/>
+      </w:pPr>
+      <w:r>
+        <w:t>Sharing follows too: the first save after a rename also migrates the trip’s public share — fresh data at the new slug and a redirect pointer at the old one (Section 19.2) — so distributed links keep working without anyone re-sharing.</w:t>
+      </w:r>
+    </w:p>
+    <w:p>
+      <w:pPr>
         <w:pStyle w:val="Heading1"/>
       </w:pPr>
       <w:r>
@@ -9891,6 +10083,9 @@
       </w:pPr>
       <w:r>
         <w:t>Renames: a renamed trip changes slug, so both Share and the save-time refresh leave a small {redirect: newSlug} pointer file at the old address; previously distributed links follow the trip to its new name. The last-used slug is remembered per trip (trip.shareSlug).</w:t>
+      </w:r>
+      <w:r>
+        <w:t xml:space="preserve"> The migration is save-driven and works even if Share is never pressed again (see Section 18.7).</w:t>
       </w:r>
     </w:p>
     <w:p>

</xml_diff>

<commit_message>
Update spec doc 2026-07-31 11:15
</commit_message>
<xml_diff>
--- a/docs/Road Trip Planner — Specification.docx
+++ b/docs/Road Trip Planner — Specification.docx
@@ -42,7 +42,7 @@
           <w:color w:val="64748B"/>
           <w:sz w:val="22"/>
         </w:rPr>
-        <w:t>Version 2.5  ·  Single-file HTML Application</w:t>
+        <w:t>Version 2.6  ·  Single-file HTML Application</w:t>
       </w:r>
     </w:p>
     <w:p>
@@ -10064,7 +10064,7 @@
           <w:i w:val="0"/>
           <w:sz w:val="22"/>
         </w:rPr>
-        <w:t>The resulting URL is https://{owner}.github.io/{repo}/?share={slug} and is shown in a copyable share modal.</w:t>
+        <w:t>The copyable URL handed out by the share modal is the trip’s static preview page, https://{owner}.github.io/{repo}/shared/{slug}.html (see below). The direct app URL ?share={slug} works identically and remains what the preview page redirects into.</w:t>
       </w:r>
     </w:p>
     <w:p>
@@ -10095,6 +10095,24 @@
       </w:pPr>
       <w:r>
         <w:t>Legacy links: share ids minted before this scheme were random {slug}-{8 hex} frozen snapshots, and many are in the wild. The viewer recognizes the pattern, tries the canonical live file FIRST, follows up to 3 redirect hops, and only falls back to the frozen legacy snapshot if no canonical file exists yet — so old links never break, and they automatically upgrade to live data after the owner’s next save or re-share of that trip.</w:t>
+      </w:r>
+    </w:p>
+    <w:p>
+      <w:pPr>
+        <w:pStyle w:val="ListBullet"/>
+        <w:ind w:left="432"/>
+      </w:pPr>
+      <w:r>
+        <w:t>Static preview pages: link unfurlers (iMessage, WhatsApp, Slack…) read &lt;title&gt;/og: tags from raw HTML and never execute JavaScript, so the app’s runtime document.title is invisible to them. Sharing therefore also publishes shared/{slug}.html — a tiny page carrying the trip name (&lt;title&gt;, og:title), a description (“Jul 1 – Jul 29, 2026 · 28 days · Road trip itinerary”), and the trip’s first photo as og:image — which immediately redirects into the app (script + meta-refresh + visible fallback link). Links shared in Messages et al. thus preview as the trip, with a photo card when one exists.</w:t>
+      </w:r>
+    </w:p>
+    <w:p>
+      <w:pPr>
+        <w:pStyle w:val="ListBullet"/>
+        <w:ind w:left="432"/>
+      </w:pPr>
+      <w:r>
+        <w:t>Preview pages stay fresh: every save-time share refresh rewrites the page (identical content is skipped by the sha-safe writer); shares created before preview pages existed get one on their next save even if the trip data is unchanged; renames re-target the old slug’s page at the new one. Pages are served by the GitHub Pages workflow, whose paths filter includes shared/*.html but NOT the frequently-refreshed shared/*.json payloads, so payload refreshes still trigger no deploys.</w:t>
       </w:r>
     </w:p>
     <w:p>

</xml_diff>